<commit_message>
Hide Programs & Templates modules from Field Users (nav + route guard)
Co-Authored-By: Claude Opus 4.8 <noreply@anthropic.com>
</commit_message>
<xml_diff>
--- a/Proposal/Form Builder.docx
+++ b/Proposal/Form Builder.docx
@@ -92,7 +92,7 @@
           <w:color w:val="7F7F7F"/>
           <w:sz w:val="22"/>
         </w:rPr>
-        <w:t>Accelerated 12-week delivery  •  Development only (UI/UX design excluded)</w:t>
+        <w:t>Accelerated 12-week delivery  •  Web platform + Mobile app (design &amp; development)</w:t>
       </w:r>
     </w:p>
     <w:p/>
@@ -192,7 +192,7 @@
           <w:b w:val="0"/>
           <w:sz w:val="21"/>
         </w:rPr>
-        <w:t>The provided Figma prototype defines a complete Phase 1 product: 4 user roles, 8 functional modules, and 44+ screens, including a drag-and-drop Form Builder with unlimited-depth conditional follow-up questions and an offline-first mobile field app with sync.</w:t>
+        <w:t>The provided Figma prototype defines a complete Phase 1 product: 4 user roles, 8 functional modules, and 44+ screens, including a drag-and-drop Form Builder with unlimited-depth conditional follow-up questions and a mobile app (React Native / Angular) for offline field data collection with sync.</w:t>
       </w:r>
     </w:p>
     <w:p>
@@ -204,7 +204,7 @@
           <w:b w:val="0"/>
           <w:sz w:val="21"/>
         </w:rPr>
-        <w:t>This proposal covers engineering (development) only — UI/UX design is excluded (FES provides the Figma design; we implement to it). It is scoped as an accelerated 12-week delivery by a lean team at India small-company rates.</w:t>
+        <w:t>This proposal covers the web platform build plus a native mobile app (UI/UX design + development). It is scoped as an accelerated 12-week delivery by a lean team at India small-company rates.</w:t>
       </w:r>
     </w:p>
     <w:tbl>
@@ -379,7 +379,7 @@
                 <w:b w:val="0"/>
                 <w:sz w:val="20"/>
               </w:rPr>
-              <w:t>~6 people (lean, blended)</w:t>
+              <w:t>~6–7 people (lean, blended)</w:t>
             </w:r>
           </w:p>
         </w:tc>
@@ -432,7 +432,7 @@
                 <w:b w:val="0"/>
                 <w:sz w:val="20"/>
               </w:rPr>
-              <w:t>~301 person-days</w:t>
+              <w:t>~302 person-days</w:t>
             </w:r>
           </w:p>
         </w:tc>
@@ -615,7 +615,7 @@
           <w:color w:val="595959"/>
           <w:sz w:val="19"/>
         </w:rPr>
-        <w:t>The 12-week plan is an accelerated, lean-team delivery. It assumes tight scope prioritization, prompt FES sign-offs, and design delivered per module at sprint start. Detailed cost breakdown in Section 8.</w:t>
+        <w:t>The 12-week plan is an accelerated, lean-team delivery. It assumes tight scope prioritization, prompt FES sign-offs, and web design (Figma) delivered per module at sprint start. Detailed cost breakdown in Section 8.</w:t>
       </w:r>
     </w:p>
     <w:p>
@@ -643,7 +643,7 @@
           <w:b w:val="0"/>
           <w:sz w:val="21"/>
         </w:rPr>
-        <w:t>The prototype is a mid-fidelity wireframe system (no backend, mocked auth, non-persisted data). It clearly specifies what to build. Our job is to build the real, secure product behind it — implementing the front-end from the design FES provides.</w:t>
+        <w:t>The prototype is a mid-fidelity wireframe system (no backend, mocked auth, non-persisted data). It clearly specifies what to build. Our job is to build the real, secure product behind it — the web platform (implemented from FES's Figma design) and a native mobile app for field users.</w:t>
       </w:r>
     </w:p>
     <w:p>
@@ -732,7 +732,7 @@
         <w:rPr>
           <w:sz w:val="21"/>
         </w:rPr>
-        <w:t xml:space="preserve"> — mobile-first, offline data collection and sync.</w:t>
+        <w:t xml:space="preserve"> — mobile app, offline data collection and sync.</w:t>
       </w:r>
     </w:p>
     <w:p>
@@ -745,7 +745,7 @@
           <w:color w:val="2E75B6"/>
           <w:sz w:val="24"/>
         </w:rPr>
-        <w:t>2.2  Functional Modules (7)</w:t>
+        <w:t>2.2  Functional Modules (8)</w:t>
       </w:r>
     </w:p>
     <w:p>
@@ -883,6 +883,25 @@
     </w:p>
     <w:p>
       <w:pPr>
+        <w:pStyle w:val="ListBullet"/>
+        <w:spacing w:after="40"/>
+      </w:pPr>
+      <w:r>
+        <w:rPr>
+          <w:b/>
+          <w:sz w:val="21"/>
+        </w:rPr>
+        <w:t xml:space="preserve">Mobile App (React Native / Angular) — </w:t>
+      </w:r>
+      <w:r>
+        <w:rPr>
+          <w:sz w:val="21"/>
+        </w:rPr>
+        <w:t xml:space="preserve"> mobile form filling for field users, offline capture (photo/GPS), drafts, submission, sync + conflict resolution.</w:t>
+      </w:r>
+    </w:p>
+    <w:p>
+      <w:pPr>
         <w:spacing w:after="120"/>
       </w:pPr>
       <w:r>
@@ -935,7 +954,7 @@
           <w:b/>
           <w:sz w:val="21"/>
         </w:rPr>
-        <w:t>Offline-first field app + sync</w:t>
+        <w:t>Offline-first mobile app + sync</w:t>
       </w:r>
       <w:r>
         <w:rPr>
@@ -969,7 +988,7 @@
           <w:b w:val="0"/>
           <w:sz w:val="21"/>
         </w:rPr>
-        <w:t>The prototype is already React + TypeScript. We carry that forward and build a matching backend.</w:t>
+        <w:t>The prototype is already React + TypeScript. We carry that forward, build a matching backend, and deliver a native mobile app.</w:t>
       </w:r>
     </w:p>
     <w:p>
@@ -1001,13 +1020,32 @@
           <w:b/>
           <w:sz w:val="21"/>
         </w:rPr>
+        <w:t xml:space="preserve">Mobile App: </w:t>
+      </w:r>
+      <w:r>
+        <w:rPr>
+          <w:sz w:val="21"/>
+        </w:rPr>
+        <w:t>React Native (or Angular / Ionic) with offline storage (SQLite/IndexedDB) and background sync — for field data collection on Android/iOS.</w:t>
+      </w:r>
+    </w:p>
+    <w:p>
+      <w:pPr>
+        <w:pStyle w:val="ListBullet"/>
+        <w:spacing w:after="40"/>
+      </w:pPr>
+      <w:r>
+        <w:rPr>
+          <w:b/>
+          <w:sz w:val="21"/>
+        </w:rPr>
         <w:t xml:space="preserve">Backend / API: </w:t>
       </w:r>
       <w:r>
         <w:rPr>
           <w:sz w:val="21"/>
         </w:rPr>
-        <w:t>Node.js (NestJS) or Python (Django REST) — REST/JSON, JWT auth, role-based authorization, multi-tenant data isolation.</w:t>
+        <w:t>Node.js (NestJS) or Python (Django REST) — REST/JSON, JWT auth, role-based authorization, multi-tenant data isolation, plus dedicated mobile APIs (auth, offline sync, submissions).</w:t>
       </w:r>
     </w:p>
     <w:p>
@@ -1201,7 +1239,7 @@
           <w:b w:val="0"/>
           <w:sz w:val="21"/>
         </w:rPr>
-        <w:t>Delivered in 6 two-week sprints. Backend and frontend run in parallel; QA is continuous.</w:t>
+        <w:t>Delivered in 6 two-week sprints. Web, backend and mobile tracks run in parallel; QA is continuous.</w:t>
       </w:r>
     </w:p>
     <w:tbl>
@@ -1220,7 +1258,7 @@
       <w:tr>
         <w:tc>
           <w:tcPr>
-            <w:tcW w:type="dxa" w:w="2736"/>
+            <w:tcW w:type="dxa" w:w="3024"/>
             <w:shd w:val="clear" w:color="auto" w:fill="1F365D"/>
             <w:tcMar>
               <w:top w:w="60" w:type="dxa"/>
@@ -1241,13 +1279,13 @@
                 <w:color w:val="FFFFFF"/>
                 <w:sz w:val="18"/>
               </w:rPr>
-              <w:t>Sprint</w:t>
+              <w:t>Sprint / Track</w:t>
             </w:r>
           </w:p>
         </w:tc>
         <w:tc>
           <w:tcPr>
-            <w:tcW w:type="dxa" w:w="1440"/>
+            <w:tcW w:type="dxa" w:w="1584"/>
             <w:shd w:val="clear" w:color="auto" w:fill="1F365D"/>
             <w:tcMar>
               <w:top w:w="60" w:type="dxa"/>
@@ -1274,7 +1312,7 @@
         </w:tc>
         <w:tc>
           <w:tcPr>
-            <w:tcW w:type="dxa" w:w="5760"/>
+            <w:tcW w:type="dxa" w:w="5328"/>
             <w:shd w:val="clear" w:color="auto" w:fill="1F365D"/>
             <w:tcMar>
               <w:top w:w="60" w:type="dxa"/>
@@ -1303,7 +1341,7 @@
       <w:tr>
         <w:tc>
           <w:tcPr>
-            <w:tcW w:type="dxa" w:w="2736"/>
+            <w:tcW w:type="dxa" w:w="3024"/>
             <w:tcMar>
               <w:top w:w="60" w:type="dxa"/>
               <w:bottom w:w="60" w:type="dxa"/>
@@ -1328,7 +1366,7 @@
         </w:tc>
         <w:tc>
           <w:tcPr>
-            <w:tcW w:type="dxa" w:w="1440"/>
+            <w:tcW w:type="dxa" w:w="1584"/>
             <w:tcMar>
               <w:top w:w="60" w:type="dxa"/>
               <w:bottom w:w="60" w:type="dxa"/>
@@ -1353,7 +1391,7 @@
         </w:tc>
         <w:tc>
           <w:tcPr>
-            <w:tcW w:type="dxa" w:w="5760"/>
+            <w:tcW w:type="dxa" w:w="5328"/>
             <w:tcMar>
               <w:top w:w="60" w:type="dxa"/>
               <w:bottom w:w="60" w:type="dxa"/>
@@ -1372,7 +1410,7 @@
                 <w:b w:val="0"/>
                 <w:sz w:val="17"/>
               </w:rPr>
-              <w:t>Discovery &amp; data model, project/CI-CD setup, environments, Auth + OTP + RBAC, app shell &amp; navigation</w:t>
+              <w:t>Discovery &amp; data model, project/CI-CD setup, environments, Auth + OTP + RBAC, app shell &amp; navigation, mobile app scaffold</w:t>
             </w:r>
           </w:p>
         </w:tc>
@@ -1380,7 +1418,7 @@
       <w:tr>
         <w:tc>
           <w:tcPr>
-            <w:tcW w:type="dxa" w:w="2736"/>
+            <w:tcW w:type="dxa" w:w="3024"/>
             <w:shd w:val="clear" w:color="auto" w:fill="EEF3FA"/>
             <w:tcMar>
               <w:top w:w="60" w:type="dxa"/>
@@ -1406,7 +1444,7 @@
         </w:tc>
         <w:tc>
           <w:tcPr>
-            <w:tcW w:type="dxa" w:w="1440"/>
+            <w:tcW w:type="dxa" w:w="1584"/>
             <w:shd w:val="clear" w:color="auto" w:fill="EEF3FA"/>
             <w:tcMar>
               <w:top w:w="60" w:type="dxa"/>
@@ -1432,7 +1470,7 @@
         </w:tc>
         <w:tc>
           <w:tcPr>
-            <w:tcW w:type="dxa" w:w="5760"/>
+            <w:tcW w:type="dxa" w:w="5328"/>
             <w:shd w:val="clear" w:color="auto" w:fill="EEF3FA"/>
             <w:tcMar>
               <w:top w:w="60" w:type="dxa"/>
@@ -1460,7 +1498,7 @@
       <w:tr>
         <w:tc>
           <w:tcPr>
-            <w:tcW w:type="dxa" w:w="2736"/>
+            <w:tcW w:type="dxa" w:w="3024"/>
             <w:tcMar>
               <w:top w:w="60" w:type="dxa"/>
               <w:bottom w:w="60" w:type="dxa"/>
@@ -1485,7 +1523,7 @@
         </w:tc>
         <w:tc>
           <w:tcPr>
-            <w:tcW w:type="dxa" w:w="1440"/>
+            <w:tcW w:type="dxa" w:w="1584"/>
             <w:tcMar>
               <w:top w:w="60" w:type="dxa"/>
               <w:bottom w:w="60" w:type="dxa"/>
@@ -1510,7 +1548,7 @@
         </w:tc>
         <w:tc>
           <w:tcPr>
-            <w:tcW w:type="dxa" w:w="5760"/>
+            <w:tcW w:type="dxa" w:w="5328"/>
             <w:tcMar>
               <w:top w:w="60" w:type="dxa"/>
               <w:bottom w:w="60" w:type="dxa"/>
@@ -1537,7 +1575,7 @@
       <w:tr>
         <w:tc>
           <w:tcPr>
-            <w:tcW w:type="dxa" w:w="2736"/>
+            <w:tcW w:type="dxa" w:w="3024"/>
             <w:shd w:val="clear" w:color="auto" w:fill="EEF3FA"/>
             <w:tcMar>
               <w:top w:w="60" w:type="dxa"/>
@@ -1557,13 +1595,13 @@
                 <w:b w:val="0"/>
                 <w:sz w:val="17"/>
               </w:rPr>
-              <w:t>Sprint 4 – Field App</w:t>
+              <w:t>Sprint 4 – Mobile Integration &amp; Sync</w:t>
             </w:r>
           </w:p>
         </w:tc>
         <w:tc>
           <w:tcPr>
-            <w:tcW w:type="dxa" w:w="1440"/>
+            <w:tcW w:type="dxa" w:w="1584"/>
             <w:shd w:val="clear" w:color="auto" w:fill="EEF3FA"/>
             <w:tcMar>
               <w:top w:w="60" w:type="dxa"/>
@@ -1589,7 +1627,7 @@
         </w:tc>
         <w:tc>
           <w:tcPr>
-            <w:tcW w:type="dxa" w:w="5760"/>
+            <w:tcW w:type="dxa" w:w="5328"/>
             <w:shd w:val="clear" w:color="auto" w:fill="EEF3FA"/>
             <w:tcMar>
               <w:top w:w="60" w:type="dxa"/>
@@ -1609,7 +1647,7 @@
                 <w:b w:val="0"/>
                 <w:sz w:val="17"/>
               </w:rPr>
-              <w:t>Mobile-first PWA, form renderer with conditional logic, offline capture (photo/GPS), drafts, sync + conflict resolution</w:t>
+              <w:t>Integrate the mobile app end-to-end, finalize sync + conflict resolution, field-user testing</w:t>
             </w:r>
           </w:p>
         </w:tc>
@@ -1617,7 +1655,7 @@
       <w:tr>
         <w:tc>
           <w:tcPr>
-            <w:tcW w:type="dxa" w:w="2736"/>
+            <w:tcW w:type="dxa" w:w="3024"/>
             <w:tcMar>
               <w:top w:w="60" w:type="dxa"/>
               <w:bottom w:w="60" w:type="dxa"/>
@@ -1642,7 +1680,7 @@
         </w:tc>
         <w:tc>
           <w:tcPr>
-            <w:tcW w:type="dxa" w:w="1440"/>
+            <w:tcW w:type="dxa" w:w="1584"/>
             <w:tcMar>
               <w:top w:w="60" w:type="dxa"/>
               <w:bottom w:w="60" w:type="dxa"/>
@@ -1667,7 +1705,7 @@
         </w:tc>
         <w:tc>
           <w:tcPr>
-            <w:tcW w:type="dxa" w:w="5760"/>
+            <w:tcW w:type="dxa" w:w="5328"/>
             <w:tcMar>
               <w:top w:w="60" w:type="dxa"/>
               <w:bottom w:w="60" w:type="dxa"/>
@@ -1694,7 +1732,7 @@
       <w:tr>
         <w:tc>
           <w:tcPr>
-            <w:tcW w:type="dxa" w:w="2736"/>
+            <w:tcW w:type="dxa" w:w="3024"/>
             <w:shd w:val="clear" w:color="auto" w:fill="EEF3FA"/>
             <w:tcMar>
               <w:top w:w="60" w:type="dxa"/>
@@ -1720,7 +1758,7 @@
         </w:tc>
         <w:tc>
           <w:tcPr>
-            <w:tcW w:type="dxa" w:w="1440"/>
+            <w:tcW w:type="dxa" w:w="1584"/>
             <w:shd w:val="clear" w:color="auto" w:fill="EEF3FA"/>
             <w:tcMar>
               <w:top w:w="60" w:type="dxa"/>
@@ -1746,7 +1784,7 @@
         </w:tc>
         <w:tc>
           <w:tcPr>
-            <w:tcW w:type="dxa" w:w="5760"/>
+            <w:tcW w:type="dxa" w:w="5328"/>
             <w:shd w:val="clear" w:color="auto" w:fill="EEF3FA"/>
             <w:tcMar>
               <w:top w:w="60" w:type="dxa"/>
@@ -1771,6 +1809,166 @@
           </w:p>
         </w:tc>
       </w:tr>
+      <w:tr>
+        <w:tc>
+          <w:tcPr>
+            <w:tcW w:type="dxa" w:w="3024"/>
+            <w:shd w:val="clear" w:color="auto" w:fill="D9E4F2"/>
+            <w:tcMar>
+              <w:top w:w="60" w:type="dxa"/>
+              <w:bottom w:w="60" w:type="dxa"/>
+              <w:start w:w="110" w:type="dxa"/>
+              <w:end w:w="110" w:type="dxa"/>
+            </w:tcMar>
+          </w:tcPr>
+          <w:p>
+            <w:pPr>
+              <w:spacing w:after="0" w:before="0"/>
+            </w:pPr>
+            <w:r/>
+            <w:r>
+              <w:rPr>
+                <w:rFonts w:ascii="Calibri" w:hAnsi="Calibri"/>
+                <w:b/>
+                <w:sz w:val="17"/>
+              </w:rPr>
+              <w:t>Mobile App UI/UX Design (parallel track)</w:t>
+            </w:r>
+          </w:p>
+        </w:tc>
+        <w:tc>
+          <w:tcPr>
+            <w:tcW w:type="dxa" w:w="1584"/>
+            <w:shd w:val="clear" w:color="auto" w:fill="D9E4F2"/>
+            <w:tcMar>
+              <w:top w:w="60" w:type="dxa"/>
+              <w:bottom w:w="60" w:type="dxa"/>
+              <w:start w:w="110" w:type="dxa"/>
+              <w:end w:w="110" w:type="dxa"/>
+            </w:tcMar>
+          </w:tcPr>
+          <w:p>
+            <w:pPr>
+              <w:spacing w:after="0" w:before="0"/>
+            </w:pPr>
+            <w:r/>
+            <w:r>
+              <w:rPr>
+                <w:rFonts w:ascii="Calibri" w:hAnsi="Calibri"/>
+                <w:b/>
+                <w:sz w:val="17"/>
+              </w:rPr>
+              <w:t>Weeks 3–5 (~3 wks)</w:t>
+            </w:r>
+          </w:p>
+        </w:tc>
+        <w:tc>
+          <w:tcPr>
+            <w:tcW w:type="dxa" w:w="5328"/>
+            <w:shd w:val="clear" w:color="auto" w:fill="D9E4F2"/>
+            <w:tcMar>
+              <w:top w:w="60" w:type="dxa"/>
+              <w:bottom w:w="60" w:type="dxa"/>
+              <w:start w:w="110" w:type="dxa"/>
+              <w:end w:w="110" w:type="dxa"/>
+            </w:tcMar>
+          </w:tcPr>
+          <w:p>
+            <w:pPr>
+              <w:spacing w:after="0" w:before="0"/>
+            </w:pPr>
+            <w:r/>
+            <w:r>
+              <w:rPr>
+                <w:rFonts w:ascii="Calibri" w:hAnsi="Calibri"/>
+                <w:b/>
+                <w:sz w:val="17"/>
+              </w:rPr>
+              <w:t>Mobile screens, flows, states &amp; assets; runs parallel to web sprints and hands off before development</w:t>
+            </w:r>
+          </w:p>
+        </w:tc>
+      </w:tr>
+      <w:tr>
+        <w:tc>
+          <w:tcPr>
+            <w:tcW w:type="dxa" w:w="3024"/>
+            <w:shd w:val="clear" w:color="auto" w:fill="D9E4F2"/>
+            <w:tcMar>
+              <w:top w:w="60" w:type="dxa"/>
+              <w:bottom w:w="60" w:type="dxa"/>
+              <w:start w:w="110" w:type="dxa"/>
+              <w:end w:w="110" w:type="dxa"/>
+            </w:tcMar>
+          </w:tcPr>
+          <w:p>
+            <w:pPr>
+              <w:spacing w:after="0" w:before="0"/>
+            </w:pPr>
+            <w:r/>
+            <w:r>
+              <w:rPr>
+                <w:rFonts w:ascii="Calibri" w:hAnsi="Calibri"/>
+                <w:b/>
+                <w:sz w:val="17"/>
+              </w:rPr>
+              <w:t>Mobile App Development — React Native / Angular (parallel track)</w:t>
+            </w:r>
+          </w:p>
+        </w:tc>
+        <w:tc>
+          <w:tcPr>
+            <w:tcW w:type="dxa" w:w="1584"/>
+            <w:shd w:val="clear" w:color="auto" w:fill="D9E4F2"/>
+            <w:tcMar>
+              <w:top w:w="60" w:type="dxa"/>
+              <w:bottom w:w="60" w:type="dxa"/>
+              <w:start w:w="110" w:type="dxa"/>
+              <w:end w:w="110" w:type="dxa"/>
+            </w:tcMar>
+          </w:tcPr>
+          <w:p>
+            <w:pPr>
+              <w:spacing w:after="0" w:before="0"/>
+            </w:pPr>
+            <w:r/>
+            <w:r>
+              <w:rPr>
+                <w:rFonts w:ascii="Calibri" w:hAnsi="Calibri"/>
+                <w:b/>
+                <w:sz w:val="17"/>
+              </w:rPr>
+              <w:t>Weeks 7–9 (~3 wks)</w:t>
+            </w:r>
+          </w:p>
+        </w:tc>
+        <w:tc>
+          <w:tcPr>
+            <w:tcW w:type="dxa" w:w="5328"/>
+            <w:shd w:val="clear" w:color="auto" w:fill="D9E4F2"/>
+            <w:tcMar>
+              <w:top w:w="60" w:type="dxa"/>
+              <w:bottom w:w="60" w:type="dxa"/>
+              <w:start w:w="110" w:type="dxa"/>
+              <w:end w:w="110" w:type="dxa"/>
+            </w:tcMar>
+          </w:tcPr>
+          <w:p>
+            <w:pPr>
+              <w:spacing w:after="0" w:before="0"/>
+            </w:pPr>
+            <w:r/>
+            <w:r>
+              <w:rPr>
+                <w:rFonts w:ascii="Calibri" w:hAnsi="Calibri"/>
+                <w:b/>
+                <w:sz w:val="17"/>
+              </w:rPr>
+              <w:t>Build the mobile app: form rendering with conditional logic, offline capture (photo/GPS), drafts, sync</w:t>
+            </w:r>
+          </w:p>
+        </w:tc>
+      </w:tr>
     </w:tbl>
     <w:p>
       <w:pPr>
@@ -1782,7 +1980,7 @@
           <w:color w:val="595959"/>
           <w:sz w:val="18"/>
         </w:rPr>
-        <w:t>*Sprint 3 spans ~3 weeks as the Form Builder is the largest component; other sprints are 2 weeks.</w:t>
+        <w:t>*Sprint 3 spans ~3 weeks as the Form Builder is the largest component; other sprints are 2 weeks. The mobile app runs as a parallel track — ~3 weeks of UI/UX design (Weeks 3–5) followed by ~3 weeks of development (Weeks 7–9) — converging into Sprint 4 for integration and sync.</w:t>
       </w:r>
     </w:p>
     <w:p>
@@ -1830,7 +2028,7 @@
       <w:tr>
         <w:tc>
           <w:tcPr>
-            <w:tcW w:type="dxa" w:w="3600"/>
+            <w:tcW w:type="dxa" w:w="3744"/>
             <w:shd w:val="clear" w:color="auto" w:fill="1F365D"/>
             <w:tcMar>
               <w:top w:w="60" w:type="dxa"/>
@@ -1884,7 +2082,7 @@
         </w:tc>
         <w:tc>
           <w:tcPr>
-            <w:tcW w:type="dxa" w:w="1728"/>
+            <w:tcW w:type="dxa" w:w="1584"/>
             <w:shd w:val="clear" w:color="auto" w:fill="1F365D"/>
             <w:tcMar>
               <w:top w:w="60" w:type="dxa"/>
@@ -1940,7 +2138,7 @@
       <w:tr>
         <w:tc>
           <w:tcPr>
-            <w:tcW w:type="dxa" w:w="3600"/>
+            <w:tcW w:type="dxa" w:w="3744"/>
             <w:tcMar>
               <w:top w:w="60" w:type="dxa"/>
               <w:bottom w:w="60" w:type="dxa"/>
@@ -1959,7 +2157,7 @@
                 <w:b w:val="0"/>
                 <w:sz w:val="18"/>
               </w:rPr>
-              <w:t>Frontend Developers (React/PWA)</w:t>
+              <w:t>Frontend Developer (React)</w:t>
             </w:r>
           </w:p>
         </w:tc>
@@ -1984,13 +2182,13 @@
                 <w:b w:val="0"/>
                 <w:sz w:val="18"/>
               </w:rPr>
-              <w:t>2</w:t>
+              <w:t>1</w:t>
             </w:r>
           </w:p>
         </w:tc>
         <w:tc>
           <w:tcPr>
-            <w:tcW w:type="dxa" w:w="1728"/>
+            <w:tcW w:type="dxa" w:w="1584"/>
             <w:tcMar>
               <w:top w:w="60" w:type="dxa"/>
               <w:bottom w:w="60" w:type="dxa"/>
@@ -2034,7 +2232,7 @@
                 <w:b w:val="0"/>
                 <w:sz w:val="18"/>
               </w:rPr>
-              <w:t>Web admin + field PWA + form builder UI</w:t>
+              <w:t>Web admin + form builder UI</w:t>
             </w:r>
           </w:p>
         </w:tc>
@@ -2042,7 +2240,7 @@
       <w:tr>
         <w:tc>
           <w:tcPr>
-            <w:tcW w:type="dxa" w:w="3600"/>
+            <w:tcW w:type="dxa" w:w="3744"/>
             <w:shd w:val="clear" w:color="auto" w:fill="EEF3FA"/>
             <w:tcMar>
               <w:top w:w="60" w:type="dxa"/>
@@ -2062,7 +2260,7 @@
                 <w:b w:val="0"/>
                 <w:sz w:val="18"/>
               </w:rPr>
-              <w:t>Backend Developers (Node/Django + PG)</w:t>
+              <w:t>Backend Developer (Node/Django + PG)</w:t>
             </w:r>
           </w:p>
         </w:tc>
@@ -2088,13 +2286,13 @@
                 <w:b w:val="0"/>
                 <w:sz w:val="18"/>
               </w:rPr>
-              <w:t>2</w:t>
+              <w:t>1</w:t>
             </w:r>
           </w:p>
         </w:tc>
         <w:tc>
           <w:tcPr>
-            <w:tcW w:type="dxa" w:w="1728"/>
+            <w:tcW w:type="dxa" w:w="1584"/>
             <w:shd w:val="clear" w:color="auto" w:fill="EEF3FA"/>
             <w:tcMar>
               <w:top w:w="60" w:type="dxa"/>
@@ -2148,7 +2346,215 @@
       <w:tr>
         <w:tc>
           <w:tcPr>
+            <w:tcW w:type="dxa" w:w="3744"/>
+            <w:tcMar>
+              <w:top w:w="60" w:type="dxa"/>
+              <w:bottom w:w="60" w:type="dxa"/>
+              <w:start w:w="110" w:type="dxa"/>
+              <w:end w:w="110" w:type="dxa"/>
+            </w:tcMar>
+          </w:tcPr>
+          <w:p>
+            <w:pPr>
+              <w:spacing w:after="0" w:before="0"/>
+            </w:pPr>
+            <w:r/>
+            <w:r>
+              <w:rPr>
+                <w:rFonts w:ascii="Calibri" w:hAnsi="Calibri"/>
+                <w:b w:val="0"/>
+                <w:sz w:val="18"/>
+              </w:rPr>
+              <w:t>Mobile App Developer (React Native / Angular)</w:t>
+            </w:r>
+          </w:p>
+        </w:tc>
+        <w:tc>
+          <w:tcPr>
+            <w:tcW w:type="dxa" w:w="1008"/>
+            <w:tcMar>
+              <w:top w:w="60" w:type="dxa"/>
+              <w:bottom w:w="60" w:type="dxa"/>
+              <w:start w:w="110" w:type="dxa"/>
+              <w:end w:w="110" w:type="dxa"/>
+            </w:tcMar>
+          </w:tcPr>
+          <w:p>
+            <w:pPr>
+              <w:spacing w:after="0" w:before="0"/>
+            </w:pPr>
+            <w:r/>
+            <w:r>
+              <w:rPr>
+                <w:rFonts w:ascii="Calibri" w:hAnsi="Calibri"/>
+                <w:b w:val="0"/>
+                <w:sz w:val="18"/>
+              </w:rPr>
+              <w:t>1–2</w:t>
+            </w:r>
+          </w:p>
+        </w:tc>
+        <w:tc>
+          <w:tcPr>
+            <w:tcW w:type="dxa" w:w="1584"/>
+            <w:tcMar>
+              <w:top w:w="60" w:type="dxa"/>
+              <w:bottom w:w="60" w:type="dxa"/>
+              <w:start w:w="110" w:type="dxa"/>
+              <w:end w:w="110" w:type="dxa"/>
+            </w:tcMar>
+          </w:tcPr>
+          <w:p>
+            <w:pPr>
+              <w:spacing w:after="0" w:before="0"/>
+            </w:pPr>
+            <w:r/>
+            <w:r>
+              <w:rPr>
+                <w:rFonts w:ascii="Calibri" w:hAnsi="Calibri"/>
+                <w:b w:val="0"/>
+                <w:sz w:val="18"/>
+              </w:rPr>
+              <w:t>Full 4 weeks</w:t>
+            </w:r>
+          </w:p>
+        </w:tc>
+        <w:tc>
+          <w:tcPr>
             <w:tcW w:type="dxa" w:w="3600"/>
+            <w:tcMar>
+              <w:top w:w="60" w:type="dxa"/>
+              <w:bottom w:w="60" w:type="dxa"/>
+              <w:start w:w="110" w:type="dxa"/>
+              <w:end w:w="110" w:type="dxa"/>
+            </w:tcMar>
+          </w:tcPr>
+          <w:p>
+            <w:pPr>
+              <w:spacing w:after="0" w:before="0"/>
+            </w:pPr>
+            <w:r/>
+            <w:r>
+              <w:rPr>
+                <w:rFonts w:ascii="Calibri" w:hAnsi="Calibri"/>
+                <w:b w:val="0"/>
+                <w:sz w:val="18"/>
+              </w:rPr>
+              <w:t>Mobile app build, offline + sync</w:t>
+            </w:r>
+          </w:p>
+        </w:tc>
+      </w:tr>
+      <w:tr>
+        <w:tc>
+          <w:tcPr>
+            <w:tcW w:type="dxa" w:w="3744"/>
+            <w:shd w:val="clear" w:color="auto" w:fill="EEF3FA"/>
+            <w:tcMar>
+              <w:top w:w="60" w:type="dxa"/>
+              <w:bottom w:w="60" w:type="dxa"/>
+              <w:start w:w="110" w:type="dxa"/>
+              <w:end w:w="110" w:type="dxa"/>
+            </w:tcMar>
+          </w:tcPr>
+          <w:p>
+            <w:pPr>
+              <w:spacing w:after="0" w:before="0"/>
+            </w:pPr>
+            <w:r/>
+            <w:r>
+              <w:rPr>
+                <w:rFonts w:ascii="Calibri" w:hAnsi="Calibri"/>
+                <w:b w:val="0"/>
+                <w:sz w:val="18"/>
+              </w:rPr>
+              <w:t>Mobile UI/UX Designer</w:t>
+            </w:r>
+          </w:p>
+        </w:tc>
+        <w:tc>
+          <w:tcPr>
+            <w:tcW w:type="dxa" w:w="1008"/>
+            <w:shd w:val="clear" w:color="auto" w:fill="EEF3FA"/>
+            <w:tcMar>
+              <w:top w:w="60" w:type="dxa"/>
+              <w:bottom w:w="60" w:type="dxa"/>
+              <w:start w:w="110" w:type="dxa"/>
+              <w:end w:w="110" w:type="dxa"/>
+            </w:tcMar>
+          </w:tcPr>
+          <w:p>
+            <w:pPr>
+              <w:spacing w:after="0" w:before="0"/>
+            </w:pPr>
+            <w:r/>
+            <w:r>
+              <w:rPr>
+                <w:rFonts w:ascii="Calibri" w:hAnsi="Calibri"/>
+                <w:b w:val="0"/>
+                <w:sz w:val="18"/>
+              </w:rPr>
+              <w:t>1</w:t>
+            </w:r>
+          </w:p>
+        </w:tc>
+        <w:tc>
+          <w:tcPr>
+            <w:tcW w:type="dxa" w:w="1584"/>
+            <w:shd w:val="clear" w:color="auto" w:fill="EEF3FA"/>
+            <w:tcMar>
+              <w:top w:w="60" w:type="dxa"/>
+              <w:bottom w:w="60" w:type="dxa"/>
+              <w:start w:w="110" w:type="dxa"/>
+              <w:end w:w="110" w:type="dxa"/>
+            </w:tcMar>
+          </w:tcPr>
+          <w:p>
+            <w:pPr>
+              <w:spacing w:after="0" w:before="0"/>
+            </w:pPr>
+            <w:r/>
+            <w:r>
+              <w:rPr>
+                <w:rFonts w:ascii="Calibri" w:hAnsi="Calibri"/>
+                <w:b w:val="0"/>
+                <w:sz w:val="18"/>
+              </w:rPr>
+              <w:t>~4 weeks (part)</w:t>
+            </w:r>
+          </w:p>
+        </w:tc>
+        <w:tc>
+          <w:tcPr>
+            <w:tcW w:type="dxa" w:w="3600"/>
+            <w:shd w:val="clear" w:color="auto" w:fill="EEF3FA"/>
+            <w:tcMar>
+              <w:top w:w="60" w:type="dxa"/>
+              <w:bottom w:w="60" w:type="dxa"/>
+              <w:start w:w="110" w:type="dxa"/>
+              <w:end w:w="110" w:type="dxa"/>
+            </w:tcMar>
+          </w:tcPr>
+          <w:p>
+            <w:pPr>
+              <w:spacing w:after="0" w:before="0"/>
+            </w:pPr>
+            <w:r/>
+            <w:r>
+              <w:rPr>
+                <w:rFonts w:ascii="Calibri" w:hAnsi="Calibri"/>
+                <w:b w:val="0"/>
+                <w:sz w:val="18"/>
+              </w:rPr>
+              <w:t>Mobile app design</w:t>
+            </w:r>
+          </w:p>
+        </w:tc>
+      </w:tr>
+      <w:tr>
+        <w:tc>
+          <w:tcPr>
+            <w:tcW w:type="dxa" w:w="3744"/>
             <w:tcMar>
               <w:top w:w="60" w:type="dxa"/>
               <w:bottom w:w="60" w:type="dxa"/>
@@ -2198,7 +2604,7 @@
         </w:tc>
         <w:tc>
           <w:tcPr>
-            <w:tcW w:type="dxa" w:w="1728"/>
+            <w:tcW w:type="dxa" w:w="1584"/>
             <w:tcMar>
               <w:top w:w="60" w:type="dxa"/>
               <w:bottom w:w="60" w:type="dxa"/>
@@ -2217,7 +2623,7 @@
                 <w:b w:val="0"/>
                 <w:sz w:val="18"/>
               </w:rPr>
-              <w:t>~8 weeks (part)</w:t>
+              <w:t>~6 weeks (part)</w:t>
             </w:r>
           </w:p>
         </w:tc>
@@ -2250,7 +2656,7 @@
       <w:tr>
         <w:tc>
           <w:tcPr>
-            <w:tcW w:type="dxa" w:w="3600"/>
+            <w:tcW w:type="dxa" w:w="3744"/>
             <w:shd w:val="clear" w:color="auto" w:fill="EEF3FA"/>
             <w:tcMar>
               <w:top w:w="60" w:type="dxa"/>
@@ -2270,7 +2676,7 @@
                 <w:b w:val="0"/>
                 <w:sz w:val="18"/>
               </w:rPr>
-              <w:t>Project Manager / Business Analyst</w:t>
+              <w:t>PM/BA · Tech Lead · DevOps</w:t>
             </w:r>
           </w:p>
         </w:tc>
@@ -2296,13 +2702,13 @@
                 <w:b w:val="0"/>
                 <w:sz w:val="18"/>
               </w:rPr>
-              <w:t>1</w:t>
+              <w:t>shared</w:t>
             </w:r>
           </w:p>
         </w:tc>
         <w:tc>
           <w:tcPr>
-            <w:tcW w:type="dxa" w:w="1728"/>
+            <w:tcW w:type="dxa" w:w="1584"/>
             <w:shd w:val="clear" w:color="auto" w:fill="EEF3FA"/>
             <w:tcMar>
               <w:top w:w="60" w:type="dxa"/>
@@ -2348,7 +2754,7 @@
                 <w:b w:val="0"/>
                 <w:sz w:val="18"/>
               </w:rPr>
-              <w:t>Delivery, backlog, FES liaison, requirements</w:t>
+              <w:t>Delivery, architecture, CI/CD, infra</w:t>
             </w:r>
           </w:p>
         </w:tc>
@@ -2356,215 +2762,7 @@
       <w:tr>
         <w:tc>
           <w:tcPr>
-            <w:tcW w:type="dxa" w:w="3600"/>
-            <w:tcMar>
-              <w:top w:w="60" w:type="dxa"/>
-              <w:bottom w:w="60" w:type="dxa"/>
-              <w:start w:w="110" w:type="dxa"/>
-              <w:end w:w="110" w:type="dxa"/>
-            </w:tcMar>
-          </w:tcPr>
-          <w:p>
-            <w:pPr>
-              <w:spacing w:after="0" w:before="0"/>
-            </w:pPr>
-            <w:r/>
-            <w:r>
-              <w:rPr>
-                <w:rFonts w:ascii="Calibri" w:hAnsi="Calibri"/>
-                <w:b w:val="0"/>
-                <w:sz w:val="18"/>
-              </w:rPr>
-              <w:t>Tech Lead / Architect</w:t>
-            </w:r>
-          </w:p>
-        </w:tc>
-        <w:tc>
-          <w:tcPr>
-            <w:tcW w:type="dxa" w:w="1008"/>
-            <w:tcMar>
-              <w:top w:w="60" w:type="dxa"/>
-              <w:bottom w:w="60" w:type="dxa"/>
-              <w:start w:w="110" w:type="dxa"/>
-              <w:end w:w="110" w:type="dxa"/>
-            </w:tcMar>
-          </w:tcPr>
-          <w:p>
-            <w:pPr>
-              <w:spacing w:after="0" w:before="0"/>
-            </w:pPr>
-            <w:r/>
-            <w:r>
-              <w:rPr>
-                <w:rFonts w:ascii="Calibri" w:hAnsi="Calibri"/>
-                <w:b w:val="0"/>
-                <w:sz w:val="18"/>
-              </w:rPr>
-              <w:t>1</w:t>
-            </w:r>
-          </w:p>
-        </w:tc>
-        <w:tc>
-          <w:tcPr>
-            <w:tcW w:type="dxa" w:w="1728"/>
-            <w:tcMar>
-              <w:top w:w="60" w:type="dxa"/>
-              <w:bottom w:w="60" w:type="dxa"/>
-              <w:start w:w="110" w:type="dxa"/>
-              <w:end w:w="110" w:type="dxa"/>
-            </w:tcMar>
-          </w:tcPr>
-          <w:p>
-            <w:pPr>
-              <w:spacing w:after="0" w:before="0"/>
-            </w:pPr>
-            <w:r/>
-            <w:r>
-              <w:rPr>
-                <w:rFonts w:ascii="Calibri" w:hAnsi="Calibri"/>
-                <w:b w:val="0"/>
-                <w:sz w:val="18"/>
-              </w:rPr>
-              <w:t>Part-time</w:t>
-            </w:r>
-          </w:p>
-        </w:tc>
-        <w:tc>
-          <w:tcPr>
-            <w:tcW w:type="dxa" w:w="3600"/>
-            <w:tcMar>
-              <w:top w:w="60" w:type="dxa"/>
-              <w:bottom w:w="60" w:type="dxa"/>
-              <w:start w:w="110" w:type="dxa"/>
-              <w:end w:w="110" w:type="dxa"/>
-            </w:tcMar>
-          </w:tcPr>
-          <w:p>
-            <w:pPr>
-              <w:spacing w:after="0" w:before="0"/>
-            </w:pPr>
-            <w:r/>
-            <w:r>
-              <w:rPr>
-                <w:rFonts w:ascii="Calibri" w:hAnsi="Calibri"/>
-                <w:b w:val="0"/>
-                <w:sz w:val="18"/>
-              </w:rPr>
-              <w:t>Architecture, code review, technical governance</w:t>
-            </w:r>
-          </w:p>
-        </w:tc>
-      </w:tr>
-      <w:tr>
-        <w:tc>
-          <w:tcPr>
-            <w:tcW w:type="dxa" w:w="3600"/>
-            <w:shd w:val="clear" w:color="auto" w:fill="EEF3FA"/>
-            <w:tcMar>
-              <w:top w:w="60" w:type="dxa"/>
-              <w:bottom w:w="60" w:type="dxa"/>
-              <w:start w:w="110" w:type="dxa"/>
-              <w:end w:w="110" w:type="dxa"/>
-            </w:tcMar>
-          </w:tcPr>
-          <w:p>
-            <w:pPr>
-              <w:spacing w:after="0" w:before="0"/>
-            </w:pPr>
-            <w:r/>
-            <w:r>
-              <w:rPr>
-                <w:rFonts w:ascii="Calibri" w:hAnsi="Calibri"/>
-                <w:b w:val="0"/>
-                <w:sz w:val="18"/>
-              </w:rPr>
-              <w:t>DevOps</w:t>
-            </w:r>
-          </w:p>
-        </w:tc>
-        <w:tc>
-          <w:tcPr>
-            <w:tcW w:type="dxa" w:w="1008"/>
-            <w:shd w:val="clear" w:color="auto" w:fill="EEF3FA"/>
-            <w:tcMar>
-              <w:top w:w="60" w:type="dxa"/>
-              <w:bottom w:w="60" w:type="dxa"/>
-              <w:start w:w="110" w:type="dxa"/>
-              <w:end w:w="110" w:type="dxa"/>
-            </w:tcMar>
-          </w:tcPr>
-          <w:p>
-            <w:pPr>
-              <w:spacing w:after="0" w:before="0"/>
-            </w:pPr>
-            <w:r/>
-            <w:r>
-              <w:rPr>
-                <w:rFonts w:ascii="Calibri" w:hAnsi="Calibri"/>
-                <w:b w:val="0"/>
-                <w:sz w:val="18"/>
-              </w:rPr>
-              <w:t>0.5</w:t>
-            </w:r>
-          </w:p>
-        </w:tc>
-        <w:tc>
-          <w:tcPr>
-            <w:tcW w:type="dxa" w:w="1728"/>
-            <w:shd w:val="clear" w:color="auto" w:fill="EEF3FA"/>
-            <w:tcMar>
-              <w:top w:w="60" w:type="dxa"/>
-              <w:bottom w:w="60" w:type="dxa"/>
-              <w:start w:w="110" w:type="dxa"/>
-              <w:end w:w="110" w:type="dxa"/>
-            </w:tcMar>
-          </w:tcPr>
-          <w:p>
-            <w:pPr>
-              <w:spacing w:after="0" w:before="0"/>
-            </w:pPr>
-            <w:r/>
-            <w:r>
-              <w:rPr>
-                <w:rFonts w:ascii="Calibri" w:hAnsi="Calibri"/>
-                <w:b w:val="0"/>
-                <w:sz w:val="18"/>
-              </w:rPr>
-              <w:t>Part-time</w:t>
-            </w:r>
-          </w:p>
-        </w:tc>
-        <w:tc>
-          <w:tcPr>
-            <w:tcW w:type="dxa" w:w="3600"/>
-            <w:shd w:val="clear" w:color="auto" w:fill="EEF3FA"/>
-            <w:tcMar>
-              <w:top w:w="60" w:type="dxa"/>
-              <w:bottom w:w="60" w:type="dxa"/>
-              <w:start w:w="110" w:type="dxa"/>
-              <w:end w:w="110" w:type="dxa"/>
-            </w:tcMar>
-          </w:tcPr>
-          <w:p>
-            <w:pPr>
-              <w:spacing w:after="0" w:before="0"/>
-            </w:pPr>
-            <w:r/>
-            <w:r>
-              <w:rPr>
-                <w:rFonts w:ascii="Calibri" w:hAnsi="Calibri"/>
-                <w:b w:val="0"/>
-                <w:sz w:val="18"/>
-              </w:rPr>
-              <w:t>CI/CD, environments, deployment, monitoring</w:t>
-            </w:r>
-          </w:p>
-        </w:tc>
-      </w:tr>
-      <w:tr>
-        <w:tc>
-          <w:tcPr>
-            <w:tcW w:type="dxa" w:w="3600"/>
+            <w:tcW w:type="dxa" w:w="3744"/>
             <w:tcMar>
               <w:top w:w="60" w:type="dxa"/>
               <w:bottom w:w="60" w:type="dxa"/>
@@ -2608,13 +2806,13 @@
                 <w:b w:val="0"/>
                 <w:sz w:val="18"/>
               </w:rPr>
-              <w:t>~6</w:t>
+              <w:t>~6–7</w:t>
             </w:r>
           </w:p>
         </w:tc>
         <w:tc>
           <w:tcPr>
-            <w:tcW w:type="dxa" w:w="1728"/>
+            <w:tcW w:type="dxa" w:w="1584"/>
             <w:tcMar>
               <w:top w:w="60" w:type="dxa"/>
               <w:bottom w:w="60" w:type="dxa"/>
@@ -2676,7 +2874,7 @@
         <w:t xml:space="preserve">Client-side (FES) involvement needed: </w:t>
       </w:r>
       <w:r>
-        <w:t>a product owner for fast sign-offs, the final UI design (Figma) and assets, subject-matter input on forms/indicators, UAT testers, and access to third-party services (SMS/email/OTP provider, domains, cloud account).</w:t>
+        <w:t>a product owner for fast sign-offs, the web UI design (Figma) and assets, subject-matter input on forms/indicators, UAT testers, and access to third-party services (SMS/email/OTP provider, domains, cloud account, app-store accounts).</w:t>
       </w:r>
     </w:p>
     <w:p>
@@ -2697,7 +2895,7 @@
           <w:color w:val="1F365D"/>
           <w:sz w:val="30"/>
         </w:rPr>
-        <w:t>7.  Effort Estimate (indicative, person-days — development only)</w:t>
+        <w:t>7.  Effort Estimate (indicative, person-days)</w:t>
       </w:r>
     </w:p>
     <w:tbl>
@@ -2904,7 +3102,7 @@
                 <w:b w:val="0"/>
                 <w:sz w:val="17"/>
               </w:rPr>
-              <w:t>12</w:t>
+              <w:t>8</w:t>
             </w:r>
           </w:p>
         </w:tc>
@@ -2930,7 +3128,7 @@
                 <w:b w:val="0"/>
                 <w:sz w:val="17"/>
               </w:rPr>
-              <w:t>18</w:t>
+              <w:t>8</w:t>
             </w:r>
           </w:p>
         </w:tc>
@@ -2956,7 +3154,7 @@
                 <w:b w:val="0"/>
                 <w:sz w:val="17"/>
               </w:rPr>
-              <w:t>4</w:t>
+              <w:t>3</w:t>
             </w:r>
           </w:p>
         </w:tc>
@@ -2982,7 +3180,7 @@
                 <w:b w:val="0"/>
                 <w:sz w:val="17"/>
               </w:rPr>
-              <w:t>34</w:t>
+              <w:t>19</w:t>
             </w:r>
           </w:p>
         </w:tc>
@@ -3037,7 +3235,7 @@
                 <w:b w:val="0"/>
                 <w:sz w:val="17"/>
               </w:rPr>
-              <w:t>22</w:t>
+              <w:t>16</w:t>
             </w:r>
           </w:p>
         </w:tc>
@@ -3064,7 +3262,7 @@
                 <w:b w:val="0"/>
                 <w:sz w:val="17"/>
               </w:rPr>
-              <w:t>20</w:t>
+              <w:t>8</w:t>
             </w:r>
           </w:p>
         </w:tc>
@@ -3091,7 +3289,7 @@
                 <w:b w:val="0"/>
                 <w:sz w:val="17"/>
               </w:rPr>
-              <w:t>6</w:t>
+              <w:t>5</w:t>
             </w:r>
           </w:p>
         </w:tc>
@@ -3118,7 +3316,7 @@
                 <w:b w:val="0"/>
                 <w:sz w:val="17"/>
               </w:rPr>
-              <w:t>48</w:t>
+              <w:t>29</w:t>
             </w:r>
           </w:p>
         </w:tc>
@@ -3171,7 +3369,7 @@
                 <w:b w:val="0"/>
                 <w:sz w:val="17"/>
               </w:rPr>
-              <w:t>34</w:t>
+              <w:t>32</w:t>
             </w:r>
           </w:p>
         </w:tc>
@@ -3197,7 +3395,7 @@
                 <w:b w:val="0"/>
                 <w:sz w:val="17"/>
               </w:rPr>
-              <w:t>16</w:t>
+              <w:t>10</w:t>
             </w:r>
           </w:p>
         </w:tc>
@@ -3249,7 +3447,7 @@
                 <w:b w:val="0"/>
                 <w:sz w:val="17"/>
               </w:rPr>
-              <w:t>58</w:t>
+              <w:t>50</w:t>
             </w:r>
           </w:p>
         </w:tc>
@@ -3277,7 +3475,7 @@
                 <w:b w:val="0"/>
                 <w:sz w:val="17"/>
               </w:rPr>
-              <w:t>Field app: renderer + offline + sync</w:t>
+              <w:t>Dashboards, analytics &amp; submissions</w:t>
             </w:r>
           </w:p>
         </w:tc>
@@ -3304,7 +3502,7 @@
                 <w:b w:val="0"/>
                 <w:sz w:val="17"/>
               </w:rPr>
-              <w:t>24</w:t>
+              <w:t>12</w:t>
             </w:r>
           </w:p>
         </w:tc>
@@ -3331,7 +3529,7 @@
                 <w:b w:val="0"/>
                 <w:sz w:val="17"/>
               </w:rPr>
-              <w:t>22</w:t>
+              <w:t>4</w:t>
             </w:r>
           </w:p>
         </w:tc>
@@ -3358,7 +3556,7 @@
                 <w:b w:val="0"/>
                 <w:sz w:val="17"/>
               </w:rPr>
-              <w:t>8</w:t>
+              <w:t>5</w:t>
             </w:r>
           </w:p>
         </w:tc>
@@ -3385,7 +3583,7 @@
                 <w:b w:val="0"/>
                 <w:sz w:val="17"/>
               </w:rPr>
-              <w:t>54</w:t>
+              <w:t>21</w:t>
             </w:r>
           </w:p>
         </w:tc>
@@ -3412,7 +3610,7 @@
                 <w:b w:val="0"/>
                 <w:sz w:val="17"/>
               </w:rPr>
-              <w:t>Dashboards, analytics &amp; submissions</w:t>
+              <w:t>Onboarding, settings, help, notifications, templates</w:t>
             </w:r>
           </w:p>
         </w:tc>
@@ -3438,274 +3636,7 @@
                 <w:b w:val="0"/>
                 <w:sz w:val="17"/>
               </w:rPr>
-              <w:t>12</w:t>
-            </w:r>
-          </w:p>
-        </w:tc>
-        <w:tc>
-          <w:tcPr>
-            <w:tcW w:type="dxa" w:w="1440"/>
-            <w:tcMar>
-              <w:top w:w="60" w:type="dxa"/>
-              <w:bottom w:w="60" w:type="dxa"/>
-              <w:start w:w="110" w:type="dxa"/>
-              <w:end w:w="110" w:type="dxa"/>
-            </w:tcMar>
-          </w:tcPr>
-          <w:p>
-            <w:pPr>
-              <w:spacing w:after="0" w:before="0"/>
-              <w:jc w:val="right"/>
-            </w:pPr>
-            <w:r/>
-            <w:r>
-              <w:rPr>
-                <w:rFonts w:ascii="Calibri" w:hAnsi="Calibri"/>
-                <w:b w:val="0"/>
-                <w:sz w:val="17"/>
-              </w:rPr>
-              <w:t>10</w:t>
-            </w:r>
-          </w:p>
-        </w:tc>
-        <w:tc>
-          <w:tcPr>
-            <w:tcW w:type="dxa" w:w="1152"/>
-            <w:tcMar>
-              <w:top w:w="60" w:type="dxa"/>
-              <w:bottom w:w="60" w:type="dxa"/>
-              <w:start w:w="110" w:type="dxa"/>
-              <w:end w:w="110" w:type="dxa"/>
-            </w:tcMar>
-          </w:tcPr>
-          <w:p>
-            <w:pPr>
-              <w:spacing w:after="0" w:before="0"/>
-              <w:jc w:val="right"/>
-            </w:pPr>
-            <w:r/>
-            <w:r>
-              <w:rPr>
-                <w:rFonts w:ascii="Calibri" w:hAnsi="Calibri"/>
-                <w:b w:val="0"/>
-                <w:sz w:val="17"/>
-              </w:rPr>
-              <w:t>5</w:t>
-            </w:r>
-          </w:p>
-        </w:tc>
-        <w:tc>
-          <w:tcPr>
-            <w:tcW w:type="dxa" w:w="1296"/>
-            <w:tcMar>
-              <w:top w:w="60" w:type="dxa"/>
-              <w:bottom w:w="60" w:type="dxa"/>
-              <w:start w:w="110" w:type="dxa"/>
-              <w:end w:w="110" w:type="dxa"/>
-            </w:tcMar>
-          </w:tcPr>
-          <w:p>
-            <w:pPr>
-              <w:spacing w:after="0" w:before="0"/>
-              <w:jc w:val="right"/>
-            </w:pPr>
-            <w:r/>
-            <w:r>
-              <w:rPr>
-                <w:rFonts w:ascii="Calibri" w:hAnsi="Calibri"/>
-                <w:b w:val="0"/>
-                <w:sz w:val="17"/>
-              </w:rPr>
-              <w:t>27</w:t>
-            </w:r>
-          </w:p>
-        </w:tc>
-      </w:tr>
-      <w:tr>
-        <w:tc>
-          <w:tcPr>
-            <w:tcW w:type="dxa" w:w="5184"/>
-            <w:shd w:val="clear" w:color="auto" w:fill="EEF3FA"/>
-            <w:tcMar>
-              <w:top w:w="60" w:type="dxa"/>
-              <w:bottom w:w="60" w:type="dxa"/>
-              <w:start w:w="110" w:type="dxa"/>
-              <w:end w:w="110" w:type="dxa"/>
-            </w:tcMar>
-          </w:tcPr>
-          <w:p>
-            <w:pPr>
-              <w:spacing w:after="0" w:before="0"/>
-            </w:pPr>
-            <w:r/>
-            <w:r>
-              <w:rPr>
-                <w:rFonts w:ascii="Calibri" w:hAnsi="Calibri"/>
-                <w:b w:val="0"/>
-                <w:sz w:val="17"/>
-              </w:rPr>
-              <w:t>Onboarding, settings, help, notifications, templates</w:t>
-            </w:r>
-          </w:p>
-        </w:tc>
-        <w:tc>
-          <w:tcPr>
-            <w:tcW w:type="dxa" w:w="1440"/>
-            <w:shd w:val="clear" w:color="auto" w:fill="EEF3FA"/>
-            <w:tcMar>
-              <w:top w:w="60" w:type="dxa"/>
-              <w:bottom w:w="60" w:type="dxa"/>
-              <w:start w:w="110" w:type="dxa"/>
-              <w:end w:w="110" w:type="dxa"/>
-            </w:tcMar>
-          </w:tcPr>
-          <w:p>
-            <w:pPr>
-              <w:spacing w:after="0" w:before="0"/>
-              <w:jc w:val="right"/>
-            </w:pPr>
-            <w:r/>
-            <w:r>
-              <w:rPr>
-                <w:rFonts w:ascii="Calibri" w:hAnsi="Calibri"/>
-                <w:b w:val="0"/>
-                <w:sz w:val="17"/>
-              </w:rPr>
-              <w:t>8</w:t>
-            </w:r>
-          </w:p>
-        </w:tc>
-        <w:tc>
-          <w:tcPr>
-            <w:tcW w:type="dxa" w:w="1440"/>
-            <w:shd w:val="clear" w:color="auto" w:fill="EEF3FA"/>
-            <w:tcMar>
-              <w:top w:w="60" w:type="dxa"/>
-              <w:bottom w:w="60" w:type="dxa"/>
-              <w:start w:w="110" w:type="dxa"/>
-              <w:end w:w="110" w:type="dxa"/>
-            </w:tcMar>
-          </w:tcPr>
-          <w:p>
-            <w:pPr>
-              <w:spacing w:after="0" w:before="0"/>
-              <w:jc w:val="right"/>
-            </w:pPr>
-            <w:r/>
-            <w:r>
-              <w:rPr>
-                <w:rFonts w:ascii="Calibri" w:hAnsi="Calibri"/>
-                <w:b w:val="0"/>
-                <w:sz w:val="17"/>
-              </w:rPr>
-              <w:t>7</w:t>
-            </w:r>
-          </w:p>
-        </w:tc>
-        <w:tc>
-          <w:tcPr>
-            <w:tcW w:type="dxa" w:w="1152"/>
-            <w:shd w:val="clear" w:color="auto" w:fill="EEF3FA"/>
-            <w:tcMar>
-              <w:top w:w="60" w:type="dxa"/>
-              <w:bottom w:w="60" w:type="dxa"/>
-              <w:start w:w="110" w:type="dxa"/>
-              <w:end w:w="110" w:type="dxa"/>
-            </w:tcMar>
-          </w:tcPr>
-          <w:p>
-            <w:pPr>
-              <w:spacing w:after="0" w:before="0"/>
-              <w:jc w:val="right"/>
-            </w:pPr>
-            <w:r/>
-            <w:r>
-              <w:rPr>
-                <w:rFonts w:ascii="Calibri" w:hAnsi="Calibri"/>
-                <w:b w:val="0"/>
-                <w:sz w:val="17"/>
-              </w:rPr>
-              <w:t>3</w:t>
-            </w:r>
-          </w:p>
-        </w:tc>
-        <w:tc>
-          <w:tcPr>
-            <w:tcW w:type="dxa" w:w="1296"/>
-            <w:shd w:val="clear" w:color="auto" w:fill="EEF3FA"/>
-            <w:tcMar>
-              <w:top w:w="60" w:type="dxa"/>
-              <w:bottom w:w="60" w:type="dxa"/>
-              <w:start w:w="110" w:type="dxa"/>
-              <w:end w:w="110" w:type="dxa"/>
-            </w:tcMar>
-          </w:tcPr>
-          <w:p>
-            <w:pPr>
-              <w:spacing w:after="0" w:before="0"/>
-              <w:jc w:val="right"/>
-            </w:pPr>
-            <w:r/>
-            <w:r>
-              <w:rPr>
-                <w:rFonts w:ascii="Calibri" w:hAnsi="Calibri"/>
-                <w:b w:val="0"/>
-                <w:sz w:val="17"/>
-              </w:rPr>
-              <w:t>18</w:t>
-            </w:r>
-          </w:p>
-        </w:tc>
-      </w:tr>
-      <w:tr>
-        <w:tc>
-          <w:tcPr>
-            <w:tcW w:type="dxa" w:w="5184"/>
-            <w:tcMar>
-              <w:top w:w="60" w:type="dxa"/>
-              <w:bottom w:w="60" w:type="dxa"/>
-              <w:start w:w="110" w:type="dxa"/>
-              <w:end w:w="110" w:type="dxa"/>
-            </w:tcMar>
-          </w:tcPr>
-          <w:p>
-            <w:pPr>
-              <w:spacing w:after="0" w:before="0"/>
-            </w:pPr>
-            <w:r/>
-            <w:r>
-              <w:rPr>
-                <w:rFonts w:ascii="Calibri" w:hAnsi="Calibri"/>
-                <w:b w:val="0"/>
-                <w:sz w:val="17"/>
-              </w:rPr>
-              <w:t>Error states, polish, integration, hardening, UAT</w:t>
-            </w:r>
-          </w:p>
-        </w:tc>
-        <w:tc>
-          <w:tcPr>
-            <w:tcW w:type="dxa" w:w="1440"/>
-            <w:tcMar>
-              <w:top w:w="60" w:type="dxa"/>
-              <w:bottom w:w="60" w:type="dxa"/>
-              <w:start w:w="110" w:type="dxa"/>
-              <w:end w:w="110" w:type="dxa"/>
-            </w:tcMar>
-          </w:tcPr>
-          <w:p>
-            <w:pPr>
-              <w:spacing w:after="0" w:before="0"/>
-              <w:jc w:val="right"/>
-            </w:pPr>
-            <w:r/>
-            <w:r>
-              <w:rPr>
-                <w:rFonts w:ascii="Calibri" w:hAnsi="Calibri"/>
-                <w:b w:val="0"/>
-                <w:sz w:val="17"/>
-              </w:rPr>
-              <w:t>3</w:t>
+              <w:t>6</w:t>
             </w:r>
           </w:p>
         </w:tc>
@@ -3757,7 +3688,7 @@
                 <w:b w:val="0"/>
                 <w:sz w:val="17"/>
               </w:rPr>
-              <w:t>4</w:t>
+              <w:t>3</w:t>
             </w:r>
           </w:p>
         </w:tc>
@@ -3783,7 +3714,143 @@
                 <w:b w:val="0"/>
                 <w:sz w:val="17"/>
               </w:rPr>
-              <w:t>9</w:t>
+              <w:t>11</w:t>
+            </w:r>
+          </w:p>
+        </w:tc>
+      </w:tr>
+      <w:tr>
+        <w:tc>
+          <w:tcPr>
+            <w:tcW w:type="dxa" w:w="5184"/>
+            <w:shd w:val="clear" w:color="auto" w:fill="EEF3FA"/>
+            <w:tcMar>
+              <w:top w:w="60" w:type="dxa"/>
+              <w:bottom w:w="60" w:type="dxa"/>
+              <w:start w:w="110" w:type="dxa"/>
+              <w:end w:w="110" w:type="dxa"/>
+            </w:tcMar>
+          </w:tcPr>
+          <w:p>
+            <w:pPr>
+              <w:spacing w:after="0" w:before="0"/>
+            </w:pPr>
+            <w:r/>
+            <w:r>
+              <w:rPr>
+                <w:rFonts w:ascii="Calibri" w:hAnsi="Calibri"/>
+                <w:b w:val="0"/>
+                <w:sz w:val="17"/>
+              </w:rPr>
+              <w:t>Error states, polish, integration, hardening, UAT</w:t>
+            </w:r>
+          </w:p>
+        </w:tc>
+        <w:tc>
+          <w:tcPr>
+            <w:tcW w:type="dxa" w:w="1440"/>
+            <w:shd w:val="clear" w:color="auto" w:fill="EEF3FA"/>
+            <w:tcMar>
+              <w:top w:w="60" w:type="dxa"/>
+              <w:bottom w:w="60" w:type="dxa"/>
+              <w:start w:w="110" w:type="dxa"/>
+              <w:end w:w="110" w:type="dxa"/>
+            </w:tcMar>
+          </w:tcPr>
+          <w:p>
+            <w:pPr>
+              <w:spacing w:after="0" w:before="0"/>
+              <w:jc w:val="right"/>
+            </w:pPr>
+            <w:r/>
+            <w:r>
+              <w:rPr>
+                <w:rFonts w:ascii="Calibri" w:hAnsi="Calibri"/>
+                <w:b w:val="0"/>
+                <w:sz w:val="17"/>
+              </w:rPr>
+              <w:t>2</w:t>
+            </w:r>
+          </w:p>
+        </w:tc>
+        <w:tc>
+          <w:tcPr>
+            <w:tcW w:type="dxa" w:w="1440"/>
+            <w:shd w:val="clear" w:color="auto" w:fill="EEF3FA"/>
+            <w:tcMar>
+              <w:top w:w="60" w:type="dxa"/>
+              <w:bottom w:w="60" w:type="dxa"/>
+              <w:start w:w="110" w:type="dxa"/>
+              <w:end w:w="110" w:type="dxa"/>
+            </w:tcMar>
+          </w:tcPr>
+          <w:p>
+            <w:pPr>
+              <w:spacing w:after="0" w:before="0"/>
+              <w:jc w:val="right"/>
+            </w:pPr>
+            <w:r/>
+            <w:r>
+              <w:rPr>
+                <w:rFonts w:ascii="Calibri" w:hAnsi="Calibri"/>
+                <w:b w:val="0"/>
+                <w:sz w:val="17"/>
+              </w:rPr>
+              <w:t>2</w:t>
+            </w:r>
+          </w:p>
+        </w:tc>
+        <w:tc>
+          <w:tcPr>
+            <w:tcW w:type="dxa" w:w="1152"/>
+            <w:shd w:val="clear" w:color="auto" w:fill="EEF3FA"/>
+            <w:tcMar>
+              <w:top w:w="60" w:type="dxa"/>
+              <w:bottom w:w="60" w:type="dxa"/>
+              <w:start w:w="110" w:type="dxa"/>
+              <w:end w:w="110" w:type="dxa"/>
+            </w:tcMar>
+          </w:tcPr>
+          <w:p>
+            <w:pPr>
+              <w:spacing w:after="0" w:before="0"/>
+              <w:jc w:val="right"/>
+            </w:pPr>
+            <w:r/>
+            <w:r>
+              <w:rPr>
+                <w:rFonts w:ascii="Calibri" w:hAnsi="Calibri"/>
+                <w:b w:val="0"/>
+                <w:sz w:val="17"/>
+              </w:rPr>
+              <w:t>2</w:t>
+            </w:r>
+          </w:p>
+        </w:tc>
+        <w:tc>
+          <w:tcPr>
+            <w:tcW w:type="dxa" w:w="1296"/>
+            <w:shd w:val="clear" w:color="auto" w:fill="EEF3FA"/>
+            <w:tcMar>
+              <w:top w:w="60" w:type="dxa"/>
+              <w:bottom w:w="60" w:type="dxa"/>
+              <w:start w:w="110" w:type="dxa"/>
+              <w:end w:w="110" w:type="dxa"/>
+            </w:tcMar>
+          </w:tcPr>
+          <w:p>
+            <w:pPr>
+              <w:spacing w:after="0" w:before="0"/>
+              <w:jc w:val="right"/>
+            </w:pPr>
+            <w:r/>
+            <w:r>
+              <w:rPr>
+                <w:rFonts w:ascii="Calibri" w:hAnsi="Calibri"/>
+                <w:b w:val="0"/>
+                <w:sz w:val="17"/>
+              </w:rPr>
+              <w:t>6</w:t>
             </w:r>
           </w:p>
         </w:tc>
@@ -3811,7 +3878,7 @@
                 <w:b/>
                 <w:sz w:val="17"/>
               </w:rPr>
-              <w:t>Subtotal (person-days)</w:t>
+              <w:t>Web subtotal (person-days)</w:t>
             </w:r>
           </w:p>
         </w:tc>
@@ -3838,7 +3905,7 @@
                 <w:b/>
                 <w:sz w:val="17"/>
               </w:rPr>
-              <w:t>115</w:t>
+              <w:t>76</w:t>
             </w:r>
           </w:p>
         </w:tc>
@@ -3865,7 +3932,7 @@
                 <w:b/>
                 <w:sz w:val="17"/>
               </w:rPr>
-              <w:t>95</w:t>
+              <w:t>34</w:t>
             </w:r>
           </w:p>
         </w:tc>
@@ -3892,7 +3959,7 @@
                 <w:b/>
                 <w:sz w:val="17"/>
               </w:rPr>
-              <w:t>38</w:t>
+              <w:t>26</w:t>
             </w:r>
           </w:p>
         </w:tc>
@@ -3919,7 +3986,7 @@
                 <w:b/>
                 <w:sz w:val="17"/>
               </w:rPr>
-              <w:t>248</w:t>
+              <w:t>136</w:t>
             </w:r>
           </w:p>
         </w:tc>
@@ -3947,7 +4014,7 @@
                 <w:b/>
                 <w:sz w:val="17"/>
               </w:rPr>
-              <w:t>PM / Tech Lead / DevOps (28 + 14 + 11)</w:t>
+              <w:t>Mobile App — UI/UX Design</w:t>
             </w:r>
           </w:p>
         </w:tc>
@@ -4052,7 +4119,405 @@
                 <w:b/>
                 <w:sz w:val="17"/>
               </w:rPr>
-              <w:t>53</w:t>
+              <w:t>30</w:t>
+            </w:r>
+          </w:p>
+        </w:tc>
+      </w:tr>
+      <w:tr>
+        <w:tc>
+          <w:tcPr>
+            <w:tcW w:type="dxa" w:w="5184"/>
+            <w:shd w:val="clear" w:color="auto" w:fill="D9E4F2"/>
+            <w:tcMar>
+              <w:top w:w="60" w:type="dxa"/>
+              <w:bottom w:w="60" w:type="dxa"/>
+              <w:start w:w="110" w:type="dxa"/>
+              <w:end w:w="110" w:type="dxa"/>
+            </w:tcMar>
+          </w:tcPr>
+          <w:p>
+            <w:pPr>
+              <w:spacing w:after="0" w:before="0"/>
+            </w:pPr>
+            <w:r/>
+            <w:r>
+              <w:rPr>
+                <w:rFonts w:ascii="Calibri" w:hAnsi="Calibri"/>
+                <w:b/>
+                <w:sz w:val="17"/>
+              </w:rPr>
+              <w:t>Mobile App — Development (React Native / Angular)</w:t>
+            </w:r>
+          </w:p>
+        </w:tc>
+        <w:tc>
+          <w:tcPr>
+            <w:tcW w:type="dxa" w:w="1440"/>
+            <w:shd w:val="clear" w:color="auto" w:fill="D9E4F2"/>
+            <w:tcMar>
+              <w:top w:w="60" w:type="dxa"/>
+              <w:bottom w:w="60" w:type="dxa"/>
+              <w:start w:w="110" w:type="dxa"/>
+              <w:end w:w="110" w:type="dxa"/>
+            </w:tcMar>
+          </w:tcPr>
+          <w:p>
+            <w:pPr>
+              <w:spacing w:after="0" w:before="0"/>
+              <w:jc w:val="right"/>
+            </w:pPr>
+            <w:r/>
+            <w:r>
+              <w:rPr>
+                <w:rFonts w:ascii="Calibri" w:hAnsi="Calibri"/>
+                <w:b/>
+                <w:sz w:val="17"/>
+              </w:rPr>
+              <w:t>52</w:t>
+            </w:r>
+          </w:p>
+        </w:tc>
+        <w:tc>
+          <w:tcPr>
+            <w:tcW w:type="dxa" w:w="1440"/>
+            <w:shd w:val="clear" w:color="auto" w:fill="D9E4F2"/>
+            <w:tcMar>
+              <w:top w:w="60" w:type="dxa"/>
+              <w:bottom w:w="60" w:type="dxa"/>
+              <w:start w:w="110" w:type="dxa"/>
+              <w:end w:w="110" w:type="dxa"/>
+            </w:tcMar>
+          </w:tcPr>
+          <w:p>
+            <w:pPr>
+              <w:spacing w:after="0" w:before="0"/>
+              <w:jc w:val="right"/>
+            </w:pPr>
+            <w:r/>
+            <w:r>
+              <w:rPr>
+                <w:rFonts w:ascii="Calibri" w:hAnsi="Calibri"/>
+                <w:b/>
+                <w:sz w:val="17"/>
+              </w:rPr>
+              <w:t>10</w:t>
+            </w:r>
+          </w:p>
+        </w:tc>
+        <w:tc>
+          <w:tcPr>
+            <w:tcW w:type="dxa" w:w="1152"/>
+            <w:shd w:val="clear" w:color="auto" w:fill="D9E4F2"/>
+            <w:tcMar>
+              <w:top w:w="60" w:type="dxa"/>
+              <w:bottom w:w="60" w:type="dxa"/>
+              <w:start w:w="110" w:type="dxa"/>
+              <w:end w:w="110" w:type="dxa"/>
+            </w:tcMar>
+          </w:tcPr>
+          <w:p>
+            <w:pPr>
+              <w:spacing w:after="0" w:before="0"/>
+              <w:jc w:val="right"/>
+            </w:pPr>
+            <w:r/>
+            <w:r>
+              <w:rPr>
+                <w:rFonts w:ascii="Calibri" w:hAnsi="Calibri"/>
+                <w:b/>
+                <w:sz w:val="17"/>
+              </w:rPr>
+              <w:t>8</w:t>
+            </w:r>
+          </w:p>
+        </w:tc>
+        <w:tc>
+          <w:tcPr>
+            <w:tcW w:type="dxa" w:w="1296"/>
+            <w:shd w:val="clear" w:color="auto" w:fill="D9E4F2"/>
+            <w:tcMar>
+              <w:top w:w="60" w:type="dxa"/>
+              <w:bottom w:w="60" w:type="dxa"/>
+              <w:start w:w="110" w:type="dxa"/>
+              <w:end w:w="110" w:type="dxa"/>
+            </w:tcMar>
+          </w:tcPr>
+          <w:p>
+            <w:pPr>
+              <w:spacing w:after="0" w:before="0"/>
+              <w:jc w:val="right"/>
+            </w:pPr>
+            <w:r/>
+            <w:r>
+              <w:rPr>
+                <w:rFonts w:ascii="Calibri" w:hAnsi="Calibri"/>
+                <w:b/>
+                <w:sz w:val="17"/>
+              </w:rPr>
+              <w:t>70</w:t>
+            </w:r>
+          </w:p>
+        </w:tc>
+      </w:tr>
+      <w:tr>
+        <w:tc>
+          <w:tcPr>
+            <w:tcW w:type="dxa" w:w="5184"/>
+            <w:shd w:val="clear" w:color="auto" w:fill="D9E4F2"/>
+            <w:tcMar>
+              <w:top w:w="60" w:type="dxa"/>
+              <w:bottom w:w="60" w:type="dxa"/>
+              <w:start w:w="110" w:type="dxa"/>
+              <w:end w:w="110" w:type="dxa"/>
+            </w:tcMar>
+          </w:tcPr>
+          <w:p>
+            <w:pPr>
+              <w:spacing w:after="0" w:before="0"/>
+            </w:pPr>
+            <w:r/>
+            <w:r>
+              <w:rPr>
+                <w:rFonts w:ascii="Calibri" w:hAnsi="Calibri"/>
+                <w:b/>
+                <w:sz w:val="17"/>
+              </w:rPr>
+              <w:t>Mobile App — API Development (auth, sync, submissions)</w:t>
+            </w:r>
+          </w:p>
+        </w:tc>
+        <w:tc>
+          <w:tcPr>
+            <w:tcW w:type="dxa" w:w="1440"/>
+            <w:shd w:val="clear" w:color="auto" w:fill="D9E4F2"/>
+            <w:tcMar>
+              <w:top w:w="60" w:type="dxa"/>
+              <w:bottom w:w="60" w:type="dxa"/>
+              <w:start w:w="110" w:type="dxa"/>
+              <w:end w:w="110" w:type="dxa"/>
+            </w:tcMar>
+          </w:tcPr>
+          <w:p>
+            <w:pPr>
+              <w:spacing w:after="0" w:before="0"/>
+              <w:jc w:val="right"/>
+            </w:pPr>
+            <w:r/>
+            <w:r>
+              <w:rPr>
+                <w:rFonts w:ascii="Calibri" w:hAnsi="Calibri"/>
+                <w:b/>
+                <w:sz w:val="17"/>
+              </w:rPr>
+            </w:r>
+          </w:p>
+        </w:tc>
+        <w:tc>
+          <w:tcPr>
+            <w:tcW w:type="dxa" w:w="1440"/>
+            <w:shd w:val="clear" w:color="auto" w:fill="D9E4F2"/>
+            <w:tcMar>
+              <w:top w:w="60" w:type="dxa"/>
+              <w:bottom w:w="60" w:type="dxa"/>
+              <w:start w:w="110" w:type="dxa"/>
+              <w:end w:w="110" w:type="dxa"/>
+            </w:tcMar>
+          </w:tcPr>
+          <w:p>
+            <w:pPr>
+              <w:spacing w:after="0" w:before="0"/>
+              <w:jc w:val="right"/>
+            </w:pPr>
+            <w:r/>
+            <w:r>
+              <w:rPr>
+                <w:rFonts w:ascii="Calibri" w:hAnsi="Calibri"/>
+                <w:b/>
+                <w:sz w:val="17"/>
+              </w:rPr>
+              <w:t>20</w:t>
+            </w:r>
+          </w:p>
+        </w:tc>
+        <w:tc>
+          <w:tcPr>
+            <w:tcW w:type="dxa" w:w="1152"/>
+            <w:shd w:val="clear" w:color="auto" w:fill="D9E4F2"/>
+            <w:tcMar>
+              <w:top w:w="60" w:type="dxa"/>
+              <w:bottom w:w="60" w:type="dxa"/>
+              <w:start w:w="110" w:type="dxa"/>
+              <w:end w:w="110" w:type="dxa"/>
+            </w:tcMar>
+          </w:tcPr>
+          <w:p>
+            <w:pPr>
+              <w:spacing w:after="0" w:before="0"/>
+              <w:jc w:val="right"/>
+            </w:pPr>
+            <w:r/>
+            <w:r>
+              <w:rPr>
+                <w:rFonts w:ascii="Calibri" w:hAnsi="Calibri"/>
+                <w:b/>
+                <w:sz w:val="17"/>
+              </w:rPr>
+            </w:r>
+          </w:p>
+        </w:tc>
+        <w:tc>
+          <w:tcPr>
+            <w:tcW w:type="dxa" w:w="1296"/>
+            <w:shd w:val="clear" w:color="auto" w:fill="D9E4F2"/>
+            <w:tcMar>
+              <w:top w:w="60" w:type="dxa"/>
+              <w:bottom w:w="60" w:type="dxa"/>
+              <w:start w:w="110" w:type="dxa"/>
+              <w:end w:w="110" w:type="dxa"/>
+            </w:tcMar>
+          </w:tcPr>
+          <w:p>
+            <w:pPr>
+              <w:spacing w:after="0" w:before="0"/>
+              <w:jc w:val="right"/>
+            </w:pPr>
+            <w:r/>
+            <w:r>
+              <w:rPr>
+                <w:rFonts w:ascii="Calibri" w:hAnsi="Calibri"/>
+                <w:b/>
+                <w:sz w:val="17"/>
+              </w:rPr>
+              <w:t>20</w:t>
+            </w:r>
+          </w:p>
+        </w:tc>
+      </w:tr>
+      <w:tr>
+        <w:tc>
+          <w:tcPr>
+            <w:tcW w:type="dxa" w:w="5184"/>
+            <w:tcMar>
+              <w:top w:w="60" w:type="dxa"/>
+              <w:bottom w:w="60" w:type="dxa"/>
+              <w:start w:w="110" w:type="dxa"/>
+              <w:end w:w="110" w:type="dxa"/>
+            </w:tcMar>
+          </w:tcPr>
+          <w:p>
+            <w:pPr>
+              <w:spacing w:after="0" w:before="0"/>
+            </w:pPr>
+            <w:r/>
+            <w:r>
+              <w:rPr>
+                <w:rFonts w:ascii="Calibri" w:hAnsi="Calibri"/>
+                <w:b w:val="0"/>
+                <w:sz w:val="17"/>
+              </w:rPr>
+              <w:t>PM / Tech Lead / DevOps (20 + 12 + 14)</w:t>
+            </w:r>
+          </w:p>
+        </w:tc>
+        <w:tc>
+          <w:tcPr>
+            <w:tcW w:type="dxa" w:w="1440"/>
+            <w:tcMar>
+              <w:top w:w="60" w:type="dxa"/>
+              <w:bottom w:w="60" w:type="dxa"/>
+              <w:start w:w="110" w:type="dxa"/>
+              <w:end w:w="110" w:type="dxa"/>
+            </w:tcMar>
+          </w:tcPr>
+          <w:p>
+            <w:pPr>
+              <w:spacing w:after="0" w:before="0"/>
+              <w:jc w:val="right"/>
+            </w:pPr>
+            <w:r/>
+            <w:r>
+              <w:rPr>
+                <w:rFonts w:ascii="Calibri" w:hAnsi="Calibri"/>
+                <w:b w:val="0"/>
+                <w:sz w:val="17"/>
+              </w:rPr>
+            </w:r>
+          </w:p>
+        </w:tc>
+        <w:tc>
+          <w:tcPr>
+            <w:tcW w:type="dxa" w:w="1440"/>
+            <w:tcMar>
+              <w:top w:w="60" w:type="dxa"/>
+              <w:bottom w:w="60" w:type="dxa"/>
+              <w:start w:w="110" w:type="dxa"/>
+              <w:end w:w="110" w:type="dxa"/>
+            </w:tcMar>
+          </w:tcPr>
+          <w:p>
+            <w:pPr>
+              <w:spacing w:after="0" w:before="0"/>
+              <w:jc w:val="right"/>
+            </w:pPr>
+            <w:r/>
+            <w:r>
+              <w:rPr>
+                <w:rFonts w:ascii="Calibri" w:hAnsi="Calibri"/>
+                <w:b w:val="0"/>
+                <w:sz w:val="17"/>
+              </w:rPr>
+            </w:r>
+          </w:p>
+        </w:tc>
+        <w:tc>
+          <w:tcPr>
+            <w:tcW w:type="dxa" w:w="1152"/>
+            <w:tcMar>
+              <w:top w:w="60" w:type="dxa"/>
+              <w:bottom w:w="60" w:type="dxa"/>
+              <w:start w:w="110" w:type="dxa"/>
+              <w:end w:w="110" w:type="dxa"/>
+            </w:tcMar>
+          </w:tcPr>
+          <w:p>
+            <w:pPr>
+              <w:spacing w:after="0" w:before="0"/>
+              <w:jc w:val="right"/>
+            </w:pPr>
+            <w:r/>
+            <w:r>
+              <w:rPr>
+                <w:rFonts w:ascii="Calibri" w:hAnsi="Calibri"/>
+                <w:b w:val="0"/>
+                <w:sz w:val="17"/>
+              </w:rPr>
+            </w:r>
+          </w:p>
+        </w:tc>
+        <w:tc>
+          <w:tcPr>
+            <w:tcW w:type="dxa" w:w="1296"/>
+            <w:tcMar>
+              <w:top w:w="60" w:type="dxa"/>
+              <w:bottom w:w="60" w:type="dxa"/>
+              <w:start w:w="110" w:type="dxa"/>
+              <w:end w:w="110" w:type="dxa"/>
+            </w:tcMar>
+          </w:tcPr>
+          <w:p>
+            <w:pPr>
+              <w:spacing w:after="0" w:before="0"/>
+              <w:jc w:val="right"/>
+            </w:pPr>
+            <w:r/>
+            <w:r>
+              <w:rPr>
+                <w:rFonts w:ascii="Calibri" w:hAnsi="Calibri"/>
+                <w:b w:val="0"/>
+                <w:sz w:val="17"/>
+              </w:rPr>
+              <w:t>46</w:t>
             </w:r>
           </w:p>
         </w:tc>
@@ -4190,12 +4655,25 @@
                 <w:color w:val="FFFFFF"/>
                 <w:sz w:val="17"/>
               </w:rPr>
-              <w:t>~301</w:t>
+              <w:t>~302</w:t>
             </w:r>
           </w:p>
         </w:tc>
       </w:tr>
     </w:tbl>
+    <w:p>
+      <w:pPr>
+        <w:spacing w:after="120"/>
+      </w:pPr>
+      <w:r>
+        <w:rPr>
+          <w:b w:val="0"/>
+          <w:color w:val="595959"/>
+          <w:sz w:val="18"/>
+        </w:rPr>
+        <w:t>Mobile App Development columns denote mobile client development (Frontend), client-side integration (Backend), and testing (QA); Mobile App API Development is server-side backend work (auth, offline sync, submissions). UI/UX Design is a design-only effort (shown in Total).</w:t>
+      </w:r>
+    </w:p>
     <w:p>
       <w:pPr>
         <w:spacing w:after="60"/>
@@ -4208,7 +4686,7 @@
         <w:t xml:space="preserve">Fit within 12 weeks: </w:t>
       </w:r>
       <w:r>
-        <w:t>Over ~12 weeks (≈60 working days per person), the team provides roughly 2 × 60 = 120 frontend and 120 backend person-days, plus part-time QA (~40 PD), PM, Tech Lead and DevOps capacity. The ~301 person-days above fit within this capacity and are delivered across the 6 sprints in Section 5.</w:t>
+        <w:t>Over ~12 weeks (≈60 working days per person), the required ~302 person-days are covered by the team below and delivered across the 6 sprints in Section 5.</w:t>
       </w:r>
     </w:p>
     <w:tbl>
@@ -4359,7 +4837,7 @@
                 <w:b w:val="0"/>
                 <w:sz w:val="18"/>
               </w:rPr>
-              <w:t>Frontend</w:t>
+              <w:t>Web Frontend</w:t>
             </w:r>
           </w:p>
         </w:tc>
@@ -4385,7 +4863,7 @@
                 <w:b w:val="0"/>
                 <w:sz w:val="18"/>
               </w:rPr>
-              <w:t>115</w:t>
+              <w:t>76</w:t>
             </w:r>
           </w:p>
         </w:tc>
@@ -4411,7 +4889,7 @@
                 <w:b w:val="0"/>
                 <w:sz w:val="18"/>
               </w:rPr>
-              <w:t>~120</w:t>
+              <w:t>~90</w:t>
             </w:r>
           </w:p>
         </w:tc>
@@ -4436,7 +4914,7 @@
                 <w:b w:val="0"/>
                 <w:sz w:val="18"/>
               </w:rPr>
-              <w:t>2 devs × 12 wks</w:t>
+              <w:t>1–2 devs</w:t>
             </w:r>
           </w:p>
         </w:tc>
@@ -4491,7 +4969,7 @@
                 <w:b w:val="0"/>
                 <w:sz w:val="18"/>
               </w:rPr>
-              <w:t>95</w:t>
+              <w:t>54</w:t>
             </w:r>
           </w:p>
         </w:tc>
@@ -4518,7 +4996,7 @@
                 <w:b w:val="0"/>
                 <w:sz w:val="18"/>
               </w:rPr>
-              <w:t>~120</w:t>
+              <w:t>~60</w:t>
             </w:r>
           </w:p>
         </w:tc>
@@ -4544,7 +5022,7 @@
                 <w:b w:val="0"/>
                 <w:sz w:val="18"/>
               </w:rPr>
-              <w:t>2 devs × 12 wks</w:t>
+              <w:t>1 dev × 12 wks</w:t>
             </w:r>
           </w:p>
         </w:tc>
@@ -4571,7 +5049,7 @@
                 <w:b w:val="0"/>
                 <w:sz w:val="18"/>
               </w:rPr>
-              <w:t>QA</w:t>
+              <w:t>Mobile App (design + dev)</w:t>
             </w:r>
           </w:p>
         </w:tc>
@@ -4597,7 +5075,7 @@
                 <w:b w:val="0"/>
                 <w:sz w:val="18"/>
               </w:rPr>
-              <w:t>38</w:t>
+              <w:t>100</w:t>
             </w:r>
           </w:p>
         </w:tc>
@@ -4623,7 +5101,7 @@
                 <w:b w:val="0"/>
                 <w:sz w:val="18"/>
               </w:rPr>
-              <w:t>~40</w:t>
+              <w:t>~110</w:t>
             </w:r>
           </w:p>
         </w:tc>
@@ -4648,7 +5126,7 @@
                 <w:b w:val="0"/>
                 <w:sz w:val="18"/>
               </w:rPr>
-              <w:t>1 × ~8 wks (part-time)</w:t>
+              <w:t>1 designer (part) + 1–2 mobile devs</w:t>
             </w:r>
           </w:p>
         </w:tc>
@@ -4676,7 +5154,7 @@
                 <w:b w:val="0"/>
                 <w:sz w:val="18"/>
               </w:rPr>
-              <w:t>PM / Tech Lead / DevOps</w:t>
+              <w:t>QA</w:t>
             </w:r>
           </w:p>
         </w:tc>
@@ -4703,7 +5181,7 @@
                 <w:b w:val="0"/>
                 <w:sz w:val="18"/>
               </w:rPr>
-              <w:t>53</w:t>
+              <w:t>26</w:t>
             </w:r>
           </w:p>
         </w:tc>
@@ -4730,7 +5208,7 @@
                 <w:b w:val="0"/>
                 <w:sz w:val="18"/>
               </w:rPr>
-              <w:t>~55</w:t>
+              <w:t>~40</w:t>
             </w:r>
           </w:p>
         </w:tc>
@@ -4738,6 +5216,110 @@
           <w:tcPr>
             <w:tcW w:type="dxa" w:w="2592"/>
             <w:shd w:val="clear" w:color="auto" w:fill="EEF3FA"/>
+            <w:tcMar>
+              <w:top w:w="60" w:type="dxa"/>
+              <w:bottom w:w="60" w:type="dxa"/>
+              <w:start w:w="110" w:type="dxa"/>
+              <w:end w:w="110" w:type="dxa"/>
+            </w:tcMar>
+          </w:tcPr>
+          <w:p>
+            <w:pPr>
+              <w:spacing w:after="0" w:before="0"/>
+            </w:pPr>
+            <w:r/>
+            <w:r>
+              <w:rPr>
+                <w:rFonts w:ascii="Calibri" w:hAnsi="Calibri"/>
+                <w:b w:val="0"/>
+                <w:sz w:val="18"/>
+              </w:rPr>
+              <w:t>1 × part-time</w:t>
+            </w:r>
+          </w:p>
+        </w:tc>
+      </w:tr>
+      <w:tr>
+        <w:tc>
+          <w:tcPr>
+            <w:tcW w:type="dxa" w:w="2880"/>
+            <w:tcMar>
+              <w:top w:w="60" w:type="dxa"/>
+              <w:bottom w:w="60" w:type="dxa"/>
+              <w:start w:w="110" w:type="dxa"/>
+              <w:end w:w="110" w:type="dxa"/>
+            </w:tcMar>
+          </w:tcPr>
+          <w:p>
+            <w:pPr>
+              <w:spacing w:after="0" w:before="0"/>
+            </w:pPr>
+            <w:r/>
+            <w:r>
+              <w:rPr>
+                <w:rFonts w:ascii="Calibri" w:hAnsi="Calibri"/>
+                <w:b w:val="0"/>
+                <w:sz w:val="18"/>
+              </w:rPr>
+              <w:t>PM / Tech Lead / DevOps</w:t>
+            </w:r>
+          </w:p>
+        </w:tc>
+        <w:tc>
+          <w:tcPr>
+            <w:tcW w:type="dxa" w:w="1728"/>
+            <w:tcMar>
+              <w:top w:w="60" w:type="dxa"/>
+              <w:bottom w:w="60" w:type="dxa"/>
+              <w:start w:w="110" w:type="dxa"/>
+              <w:end w:w="110" w:type="dxa"/>
+            </w:tcMar>
+          </w:tcPr>
+          <w:p>
+            <w:pPr>
+              <w:spacing w:after="0" w:before="0"/>
+              <w:jc w:val="right"/>
+            </w:pPr>
+            <w:r/>
+            <w:r>
+              <w:rPr>
+                <w:rFonts w:ascii="Calibri" w:hAnsi="Calibri"/>
+                <w:b w:val="0"/>
+                <w:sz w:val="18"/>
+              </w:rPr>
+              <w:t>46</w:t>
+            </w:r>
+          </w:p>
+        </w:tc>
+        <w:tc>
+          <w:tcPr>
+            <w:tcW w:type="dxa" w:w="2736"/>
+            <w:tcMar>
+              <w:top w:w="60" w:type="dxa"/>
+              <w:bottom w:w="60" w:type="dxa"/>
+              <w:start w:w="110" w:type="dxa"/>
+              <w:end w:w="110" w:type="dxa"/>
+            </w:tcMar>
+          </w:tcPr>
+          <w:p>
+            <w:pPr>
+              <w:spacing w:after="0" w:before="0"/>
+              <w:jc w:val="right"/>
+            </w:pPr>
+            <w:r/>
+            <w:r>
+              <w:rPr>
+                <w:rFonts w:ascii="Calibri" w:hAnsi="Calibri"/>
+                <w:b w:val="0"/>
+                <w:sz w:val="18"/>
+              </w:rPr>
+              <w:t>~50</w:t>
+            </w:r>
+          </w:p>
+        </w:tc>
+        <w:tc>
+          <w:tcPr>
+            <w:tcW w:type="dxa" w:w="2592"/>
             <w:tcMar>
               <w:top w:w="60" w:type="dxa"/>
               <w:bottom w:w="60" w:type="dxa"/>
@@ -4787,7 +5369,7 @@
           <w:b w:val="0"/>
           <w:sz w:val="21"/>
         </w:rPr>
-        <w:t>Development only (UI/UX design excluded). All amounts in INR at India small-company day-rates. Costs are built up from effort (person-days) × discipline day-rate. GST @ 18% is applied on professional fees.</w:t>
+        <w:t>All amounts in INR at India small-company day-rates. Costs are built up from effort (person-days) × discipline day-rate. GST @ 18% is applied on professional fees.</w:t>
       </w:r>
     </w:p>
     <w:tbl>
@@ -4992,7 +5574,7 @@
                 <w:b w:val="0"/>
                 <w:sz w:val="17"/>
               </w:rPr>
-              <w:t>Frontend Development (web admin + field PWA + form builder UI)</w:t>
+              <w:t>Frontend Development (web admin + form builder UI)</w:t>
             </w:r>
           </w:p>
         </w:tc>
@@ -5018,7 +5600,7 @@
                 <w:b w:val="0"/>
                 <w:sz w:val="17"/>
               </w:rPr>
-              <w:t>115</w:t>
+              <w:t>76</w:t>
             </w:r>
           </w:p>
         </w:tc>
@@ -5070,7 +5652,7 @@
                 <w:b w:val="0"/>
                 <w:sz w:val="17"/>
               </w:rPr>
-              <w:t>5,75,000</w:t>
+              <w:t>3,80,000</w:t>
             </w:r>
           </w:p>
         </w:tc>
@@ -5124,7 +5706,7 @@
                 <w:b w:val="0"/>
                 <w:sz w:val="17"/>
               </w:rPr>
-              <w:t>Backend Development (APIs, schema engine, sync, auth, multi-tenancy)</w:t>
+              <w:t>Backend Development — web platform (schema engine, auth, multi-tenancy)</w:t>
             </w:r>
           </w:p>
         </w:tc>
@@ -5151,7 +5733,7 @@
                 <w:b w:val="0"/>
                 <w:sz w:val="17"/>
               </w:rPr>
-              <w:t>95</w:t>
+              <w:t>34</w:t>
             </w:r>
           </w:p>
         </w:tc>
@@ -5205,7 +5787,7 @@
                 <w:b w:val="0"/>
                 <w:sz w:val="17"/>
               </w:rPr>
-              <w:t>5,22,500</w:t>
+              <w:t>1,87,000</w:t>
             </w:r>
           </w:p>
         </w:tc>
@@ -5283,7 +5865,7 @@
                 <w:b w:val="0"/>
                 <w:sz w:val="17"/>
               </w:rPr>
-              <w:t>38</w:t>
+              <w:t>26</w:t>
             </w:r>
           </w:p>
         </w:tc>
@@ -5335,7 +5917,7 @@
                 <w:b w:val="0"/>
                 <w:sz w:val="17"/>
               </w:rPr>
-              <w:t>1,33,000</w:t>
+              <w:t>91,000</w:t>
             </w:r>
           </w:p>
         </w:tc>
@@ -5416,7 +5998,7 @@
                 <w:b w:val="0"/>
                 <w:sz w:val="17"/>
               </w:rPr>
-              <w:t>28</w:t>
+              <w:t>20</w:t>
             </w:r>
           </w:p>
         </w:tc>
@@ -5470,7 +6052,7 @@
                 <w:b w:val="0"/>
                 <w:sz w:val="17"/>
               </w:rPr>
-              <w:t>1,40,000</w:t>
+              <w:t>1,00,000</w:t>
             </w:r>
           </w:p>
         </w:tc>
@@ -5548,7 +6130,7 @@
                 <w:b w:val="0"/>
                 <w:sz w:val="17"/>
               </w:rPr>
-              <w:t>14</w:t>
+              <w:t>12</w:t>
             </w:r>
           </w:p>
         </w:tc>
@@ -5600,7 +6182,7 @@
                 <w:b w:val="0"/>
                 <w:sz w:val="17"/>
               </w:rPr>
-              <w:t>98,000</w:t>
+              <w:t>84,000</w:t>
             </w:r>
           </w:p>
         </w:tc>
@@ -5681,7 +6263,7 @@
                 <w:b w:val="0"/>
                 <w:sz w:val="17"/>
               </w:rPr>
-              <w:t>11</w:t>
+              <w:t>14</w:t>
             </w:r>
           </w:p>
         </w:tc>
@@ -5735,7 +6317,402 @@
                 <w:b w:val="0"/>
                 <w:sz w:val="17"/>
               </w:rPr>
-              <w:t>60,500</w:t>
+              <w:t>77,000</w:t>
+            </w:r>
+          </w:p>
+        </w:tc>
+      </w:tr>
+      <w:tr>
+        <w:tc>
+          <w:tcPr>
+            <w:tcW w:type="dxa" w:w="504"/>
+            <w:tcMar>
+              <w:top w:w="60" w:type="dxa"/>
+              <w:bottom w:w="60" w:type="dxa"/>
+              <w:start w:w="110" w:type="dxa"/>
+              <w:end w:w="110" w:type="dxa"/>
+            </w:tcMar>
+          </w:tcPr>
+          <w:p>
+            <w:pPr>
+              <w:spacing w:after="0" w:before="0"/>
+            </w:pPr>
+            <w:r/>
+            <w:r>
+              <w:rPr>
+                <w:rFonts w:ascii="Calibri" w:hAnsi="Calibri"/>
+                <w:b w:val="0"/>
+                <w:sz w:val="17"/>
+              </w:rPr>
+              <w:t>7</w:t>
+            </w:r>
+          </w:p>
+        </w:tc>
+        <w:tc>
+          <w:tcPr>
+            <w:tcW w:type="dxa" w:w="5040"/>
+            <w:tcMar>
+              <w:top w:w="60" w:type="dxa"/>
+              <w:bottom w:w="60" w:type="dxa"/>
+              <w:start w:w="110" w:type="dxa"/>
+              <w:end w:w="110" w:type="dxa"/>
+            </w:tcMar>
+          </w:tcPr>
+          <w:p>
+            <w:pPr>
+              <w:spacing w:after="0" w:before="0"/>
+            </w:pPr>
+            <w:r/>
+            <w:r>
+              <w:rPr>
+                <w:rFonts w:ascii="Calibri" w:hAnsi="Calibri"/>
+                <w:b w:val="0"/>
+                <w:sz w:val="17"/>
+              </w:rPr>
+              <w:t>Mobile App UI/UX Design</w:t>
+            </w:r>
+          </w:p>
+        </w:tc>
+        <w:tc>
+          <w:tcPr>
+            <w:tcW w:type="dxa" w:w="1368"/>
+            <w:tcMar>
+              <w:top w:w="60" w:type="dxa"/>
+              <w:bottom w:w="60" w:type="dxa"/>
+              <w:start w:w="110" w:type="dxa"/>
+              <w:end w:w="110" w:type="dxa"/>
+            </w:tcMar>
+          </w:tcPr>
+          <w:p>
+            <w:pPr>
+              <w:spacing w:after="0" w:before="0"/>
+              <w:jc w:val="right"/>
+            </w:pPr>
+            <w:r/>
+            <w:r>
+              <w:rPr>
+                <w:rFonts w:ascii="Calibri" w:hAnsi="Calibri"/>
+                <w:b w:val="0"/>
+                <w:sz w:val="17"/>
+              </w:rPr>
+              <w:t>30</w:t>
+            </w:r>
+          </w:p>
+        </w:tc>
+        <w:tc>
+          <w:tcPr>
+            <w:tcW w:type="dxa" w:w="1512"/>
+            <w:tcMar>
+              <w:top w:w="60" w:type="dxa"/>
+              <w:bottom w:w="60" w:type="dxa"/>
+              <w:start w:w="110" w:type="dxa"/>
+              <w:end w:w="110" w:type="dxa"/>
+            </w:tcMar>
+          </w:tcPr>
+          <w:p>
+            <w:pPr>
+              <w:spacing w:after="0" w:before="0"/>
+              <w:jc w:val="right"/>
+            </w:pPr>
+            <w:r/>
+            <w:r>
+              <w:rPr>
+                <w:rFonts w:ascii="Calibri" w:hAnsi="Calibri"/>
+                <w:b w:val="0"/>
+                <w:sz w:val="17"/>
+              </w:rPr>
+              <w:t>5,000</w:t>
+            </w:r>
+          </w:p>
+        </w:tc>
+        <w:tc>
+          <w:tcPr>
+            <w:tcW w:type="dxa" w:w="1656"/>
+            <w:tcMar>
+              <w:top w:w="60" w:type="dxa"/>
+              <w:bottom w:w="60" w:type="dxa"/>
+              <w:start w:w="110" w:type="dxa"/>
+              <w:end w:w="110" w:type="dxa"/>
+            </w:tcMar>
+          </w:tcPr>
+          <w:p>
+            <w:pPr>
+              <w:spacing w:after="0" w:before="0"/>
+              <w:jc w:val="right"/>
+            </w:pPr>
+            <w:r/>
+            <w:r>
+              <w:rPr>
+                <w:rFonts w:ascii="Calibri" w:hAnsi="Calibri"/>
+                <w:b w:val="0"/>
+                <w:sz w:val="17"/>
+              </w:rPr>
+              <w:t>1,50,000</w:t>
+            </w:r>
+          </w:p>
+        </w:tc>
+      </w:tr>
+      <w:tr>
+        <w:tc>
+          <w:tcPr>
+            <w:tcW w:type="dxa" w:w="504"/>
+            <w:shd w:val="clear" w:color="auto" w:fill="EEF3FA"/>
+            <w:tcMar>
+              <w:top w:w="60" w:type="dxa"/>
+              <w:bottom w:w="60" w:type="dxa"/>
+              <w:start w:w="110" w:type="dxa"/>
+              <w:end w:w="110" w:type="dxa"/>
+            </w:tcMar>
+          </w:tcPr>
+          <w:p>
+            <w:pPr>
+              <w:spacing w:after="0" w:before="0"/>
+            </w:pPr>
+            <w:r/>
+            <w:r>
+              <w:rPr>
+                <w:rFonts w:ascii="Calibri" w:hAnsi="Calibri"/>
+                <w:b w:val="0"/>
+                <w:sz w:val="17"/>
+              </w:rPr>
+              <w:t>8</w:t>
+            </w:r>
+          </w:p>
+        </w:tc>
+        <w:tc>
+          <w:tcPr>
+            <w:tcW w:type="dxa" w:w="5040"/>
+            <w:shd w:val="clear" w:color="auto" w:fill="EEF3FA"/>
+            <w:tcMar>
+              <w:top w:w="60" w:type="dxa"/>
+              <w:bottom w:w="60" w:type="dxa"/>
+              <w:start w:w="110" w:type="dxa"/>
+              <w:end w:w="110" w:type="dxa"/>
+            </w:tcMar>
+          </w:tcPr>
+          <w:p>
+            <w:pPr>
+              <w:spacing w:after="0" w:before="0"/>
+            </w:pPr>
+            <w:r/>
+            <w:r>
+              <w:rPr>
+                <w:rFonts w:ascii="Calibri" w:hAnsi="Calibri"/>
+                <w:b w:val="0"/>
+                <w:sz w:val="17"/>
+              </w:rPr>
+              <w:t>Mobile App Development (React Native / Angular)</w:t>
+            </w:r>
+          </w:p>
+        </w:tc>
+        <w:tc>
+          <w:tcPr>
+            <w:tcW w:type="dxa" w:w="1368"/>
+            <w:shd w:val="clear" w:color="auto" w:fill="EEF3FA"/>
+            <w:tcMar>
+              <w:top w:w="60" w:type="dxa"/>
+              <w:bottom w:w="60" w:type="dxa"/>
+              <w:start w:w="110" w:type="dxa"/>
+              <w:end w:w="110" w:type="dxa"/>
+            </w:tcMar>
+          </w:tcPr>
+          <w:p>
+            <w:pPr>
+              <w:spacing w:after="0" w:before="0"/>
+              <w:jc w:val="right"/>
+            </w:pPr>
+            <w:r/>
+            <w:r>
+              <w:rPr>
+                <w:rFonts w:ascii="Calibri" w:hAnsi="Calibri"/>
+                <w:b w:val="0"/>
+                <w:sz w:val="17"/>
+              </w:rPr>
+              <w:t>70</w:t>
+            </w:r>
+          </w:p>
+        </w:tc>
+        <w:tc>
+          <w:tcPr>
+            <w:tcW w:type="dxa" w:w="1512"/>
+            <w:shd w:val="clear" w:color="auto" w:fill="EEF3FA"/>
+            <w:tcMar>
+              <w:top w:w="60" w:type="dxa"/>
+              <w:bottom w:w="60" w:type="dxa"/>
+              <w:start w:w="110" w:type="dxa"/>
+              <w:end w:w="110" w:type="dxa"/>
+            </w:tcMar>
+          </w:tcPr>
+          <w:p>
+            <w:pPr>
+              <w:spacing w:after="0" w:before="0"/>
+              <w:jc w:val="right"/>
+            </w:pPr>
+            <w:r/>
+            <w:r>
+              <w:rPr>
+                <w:rFonts w:ascii="Calibri" w:hAnsi="Calibri"/>
+                <w:b w:val="0"/>
+                <w:sz w:val="17"/>
+              </w:rPr>
+              <w:t>5,000</w:t>
+            </w:r>
+          </w:p>
+        </w:tc>
+        <w:tc>
+          <w:tcPr>
+            <w:tcW w:type="dxa" w:w="1656"/>
+            <w:shd w:val="clear" w:color="auto" w:fill="EEF3FA"/>
+            <w:tcMar>
+              <w:top w:w="60" w:type="dxa"/>
+              <w:bottom w:w="60" w:type="dxa"/>
+              <w:start w:w="110" w:type="dxa"/>
+              <w:end w:w="110" w:type="dxa"/>
+            </w:tcMar>
+          </w:tcPr>
+          <w:p>
+            <w:pPr>
+              <w:spacing w:after="0" w:before="0"/>
+              <w:jc w:val="right"/>
+            </w:pPr>
+            <w:r/>
+            <w:r>
+              <w:rPr>
+                <w:rFonts w:ascii="Calibri" w:hAnsi="Calibri"/>
+                <w:b w:val="0"/>
+                <w:sz w:val="17"/>
+              </w:rPr>
+              <w:t>3,50,000</w:t>
+            </w:r>
+          </w:p>
+        </w:tc>
+      </w:tr>
+      <w:tr>
+        <w:tc>
+          <w:tcPr>
+            <w:tcW w:type="dxa" w:w="504"/>
+            <w:tcMar>
+              <w:top w:w="60" w:type="dxa"/>
+              <w:bottom w:w="60" w:type="dxa"/>
+              <w:start w:w="110" w:type="dxa"/>
+              <w:end w:w="110" w:type="dxa"/>
+            </w:tcMar>
+          </w:tcPr>
+          <w:p>
+            <w:pPr>
+              <w:spacing w:after="0" w:before="0"/>
+            </w:pPr>
+            <w:r/>
+            <w:r>
+              <w:rPr>
+                <w:rFonts w:ascii="Calibri" w:hAnsi="Calibri"/>
+                <w:b w:val="0"/>
+                <w:sz w:val="17"/>
+              </w:rPr>
+              <w:t>9</w:t>
+            </w:r>
+          </w:p>
+        </w:tc>
+        <w:tc>
+          <w:tcPr>
+            <w:tcW w:type="dxa" w:w="5040"/>
+            <w:tcMar>
+              <w:top w:w="60" w:type="dxa"/>
+              <w:bottom w:w="60" w:type="dxa"/>
+              <w:start w:w="110" w:type="dxa"/>
+              <w:end w:w="110" w:type="dxa"/>
+            </w:tcMar>
+          </w:tcPr>
+          <w:p>
+            <w:pPr>
+              <w:spacing w:after="0" w:before="0"/>
+            </w:pPr>
+            <w:r/>
+            <w:r>
+              <w:rPr>
+                <w:rFonts w:ascii="Calibri" w:hAnsi="Calibri"/>
+                <w:b w:val="0"/>
+                <w:sz w:val="17"/>
+              </w:rPr>
+              <w:t>Mobile App API Development (auth, offline sync, submissions)</w:t>
+            </w:r>
+          </w:p>
+        </w:tc>
+        <w:tc>
+          <w:tcPr>
+            <w:tcW w:type="dxa" w:w="1368"/>
+            <w:tcMar>
+              <w:top w:w="60" w:type="dxa"/>
+              <w:bottom w:w="60" w:type="dxa"/>
+              <w:start w:w="110" w:type="dxa"/>
+              <w:end w:w="110" w:type="dxa"/>
+            </w:tcMar>
+          </w:tcPr>
+          <w:p>
+            <w:pPr>
+              <w:spacing w:after="0" w:before="0"/>
+              <w:jc w:val="right"/>
+            </w:pPr>
+            <w:r/>
+            <w:r>
+              <w:rPr>
+                <w:rFonts w:ascii="Calibri" w:hAnsi="Calibri"/>
+                <w:b w:val="0"/>
+                <w:sz w:val="17"/>
+              </w:rPr>
+              <w:t>20</w:t>
+            </w:r>
+          </w:p>
+        </w:tc>
+        <w:tc>
+          <w:tcPr>
+            <w:tcW w:type="dxa" w:w="1512"/>
+            <w:tcMar>
+              <w:top w:w="60" w:type="dxa"/>
+              <w:bottom w:w="60" w:type="dxa"/>
+              <w:start w:w="110" w:type="dxa"/>
+              <w:end w:w="110" w:type="dxa"/>
+            </w:tcMar>
+          </w:tcPr>
+          <w:p>
+            <w:pPr>
+              <w:spacing w:after="0" w:before="0"/>
+              <w:jc w:val="right"/>
+            </w:pPr>
+            <w:r/>
+            <w:r>
+              <w:rPr>
+                <w:rFonts w:ascii="Calibri" w:hAnsi="Calibri"/>
+                <w:b w:val="0"/>
+                <w:sz w:val="17"/>
+              </w:rPr>
+              <w:t>5,500</w:t>
+            </w:r>
+          </w:p>
+        </w:tc>
+        <w:tc>
+          <w:tcPr>
+            <w:tcW w:type="dxa" w:w="1656"/>
+            <w:tcMar>
+              <w:top w:w="60" w:type="dxa"/>
+              <w:bottom w:w="60" w:type="dxa"/>
+              <w:start w:w="110" w:type="dxa"/>
+              <w:end w:w="110" w:type="dxa"/>
+            </w:tcMar>
+          </w:tcPr>
+          <w:p>
+            <w:pPr>
+              <w:spacing w:after="0" w:before="0"/>
+              <w:jc w:val="right"/>
+            </w:pPr>
+            <w:r/>
+            <w:r>
+              <w:rPr>
+                <w:rFonts w:ascii="Calibri" w:hAnsi="Calibri"/>
+                <w:b w:val="0"/>
+                <w:sz w:val="17"/>
+              </w:rPr>
+              <w:t>1,10,000</w:t>
             </w:r>
           </w:p>
         </w:tc>
@@ -5815,7 +6792,7 @@
                 <w:b/>
                 <w:sz w:val="17"/>
               </w:rPr>
-              <w:t>301</w:t>
+              <w:t>302</w:t>
             </w:r>
           </w:p>
         </w:tc>
@@ -6775,7 +7752,7 @@
                 <w:b w:val="0"/>
                 <w:sz w:val="18"/>
               </w:rPr>
-              <w:t>Field App (offline + sync)</w:t>
+              <w:t>Mobile App (offline + sync)</w:t>
             </w:r>
           </w:p>
         </w:tc>
@@ -7004,11 +7981,6 @@
       </w:r>
     </w:p>
     <w:p>
-      <w:r>
-        <w:br w:type="page"/>
-      </w:r>
-    </w:p>
-    <w:p>
       <w:pPr>
         <w:spacing w:before="320" w:after="120"/>
         <w:pBdr>
@@ -7045,6 +8017,18 @@
         <w:rPr>
           <w:sz w:val="21"/>
         </w:rPr>
+        <w:t>Web UI design is provided by FES (Figma); mobile app UI/UX design is included in this proposal.</w:t>
+      </w:r>
+    </w:p>
+    <w:p>
+      <w:pPr>
+        <w:pStyle w:val="ListBullet"/>
+        <w:spacing w:after="40"/>
+      </w:pPr>
+      <w:r>
+        <w:rPr>
+          <w:sz w:val="21"/>
+        </w:rPr>
         <w:t>The Figma prototype is the agreed functional scope; material additions are handled via change requests.</w:t>
       </w:r>
     </w:p>
@@ -7057,7 +8041,7 @@
         <w:rPr>
           <w:sz w:val="21"/>
         </w:rPr>
-        <w:t>Field app is delivered as an installable PWA; native iOS/Android apps are an optional add-on.</w:t>
+        <w:t>Mobile app is built with React Native (or Angular / Ionic) for Android/iOS; app-store publishing/accounts are handled by FES (support included).</w:t>
       </w:r>
     </w:p>
     <w:p>
@@ -7215,7 +8199,7 @@
                 <w:b w:val="0"/>
                 <w:sz w:val="19"/>
               </w:rPr>
-              <w:t>Strict sprint scope, parallel FE/BE tracks, lower-priority items phased; weekly burn-down tracking</w:t>
+              <w:t>Strict sprint scope, parallel web/backend/mobile tracks, lower-priority items phased; weekly burn-down tracking</w:t>
             </w:r>
           </w:p>
         </w:tc>
@@ -7243,7 +8227,7 @@
                 <w:b w:val="0"/>
                 <w:sz w:val="19"/>
               </w:rPr>
-              <w:t>Design delivered late/incomplete by FES</w:t>
+              <w:t>Web design delivered late/incomplete by FES</w:t>
             </w:r>
           </w:p>
         </w:tc>
@@ -7458,7 +8442,7 @@
         <w:rPr>
           <w:sz w:val="21"/>
         </w:rPr>
-        <w:t>Production web application (all admin roles) + field PWA, implemented from FES design.</w:t>
+        <w:t>Production web application (all admin roles), implemented from FES design.</w:t>
       </w:r>
     </w:p>
     <w:p>
@@ -7470,7 +8454,19 @@
         <w:rPr>
           <w:sz w:val="21"/>
         </w:rPr>
-        <w:t>Backend APIs, database, and infrastructure (CI/CD).</w:t>
+        <w:t>Mobile app (React Native / Angular) for field users — including its UI/UX design.</w:t>
+      </w:r>
+    </w:p>
+    <w:p>
+      <w:pPr>
+        <w:pStyle w:val="ListBullet"/>
+        <w:spacing w:after="40"/>
+      </w:pPr>
+      <w:r>
+        <w:rPr>
+          <w:sz w:val="21"/>
+        </w:rPr>
+        <w:t>Backend APIs (web + mobile: auth, offline sync, submissions), database, and infrastructure (CI/CD).</w:t>
       </w:r>
     </w:p>
     <w:p>
@@ -7569,7 +8565,7 @@
           <w:color w:val="7F7F7F"/>
           <w:sz w:val="18"/>
         </w:rPr>
-        <w:t>This is an indicative, development-only proposal (UI/UX design excluded) based on the Phase 1 prototype, scoped for an accelerated 12-week delivery at India small-company rates. Final scope and pricing are confirmed at kickoff.</w:t>
+        <w:t>This is an indicative proposal (web build + mobile app design &amp; development) based on the Phase 1 prototype, scoped for an accelerated 12-week delivery at India small-company rates. Final scope and pricing are confirmed at kickoff.</w:t>
       </w:r>
     </w:p>
     <w:sectPr>
@@ -7595,7 +8591,7 @@
         <w:color w:val="7F7F7F"/>
         <w:sz w:val="16"/>
       </w:rPr>
-      <w:t>FES Commons Platform — Development Proposal  |  Pseudocode  |  Confidential</w:t>
+      <w:t>FES Form Builder — Development Proposal  |  Pseudocode  |  Confidential</w:t>
     </w:r>
   </w:p>
 </w:ftr>

</xml_diff>